<commit_message>
docs: documentos actualizados a mysql y modelos en mysql workbench
</commit_message>
<xml_diff>
--- a/documentos/fase1/01_Propuesta_del_Proyecto.docx
+++ b/documentos/fase1/01_Propuesta_del_Proyecto.docx
@@ -1413,7 +1413,7 @@
         <w:rPr>
           <w:lang w:val="es-CO"/>
         </w:rPr>
-        <w:t xml:space="preserve">el modelo físico en Oracle sobre una máquina virtual Oracle Linux, con una aplicación web de consulta.</w:t>
+        <w:t xml:space="preserve">el modelo físico en MySQL sobre una máquina virtual Oracle Linux, con una aplicación web de consulta.</w:t>
       </w:r>
     </w:p>
     <w:p>
@@ -1481,7 +1481,7 @@
         <w:rPr>
           <w:lang w:val="es-CO"/>
         </w:rPr>
-        <w:t xml:space="preserve">Construir el modelo lógico en notación Barker / Crow’s Foot y el modelo relacional en Crow’s Foot con SQL</w:t>
+        <w:t xml:space="preserve">Construir el modelo lógico en notación Barker / Crow’s Foot y el modelo relacional en Crow’s Foot con MySQL</w:t>
       </w:r>
       <w:r>
         <w:rPr>
@@ -1493,7 +1493,7 @@
         <w:rPr>
           <w:lang w:val="es-CO"/>
         </w:rPr>
-        <w:t xml:space="preserve">Developer Data Modeler.</w:t>
+        <w:t xml:space="preserve">Workbench.</w:t>
       </w:r>
     </w:p>
     <w:p>
@@ -4754,7 +4754,7 @@
                 <w:sz w:val="19"/>
                 <w:lang w:val="es-CO"/>
               </w:rPr>
-              <w:t xml:space="preserve">Oracle SQL Developer Data Modeler; Graphviz para diagramas de documentación</w:t>
+              <w:t xml:space="preserve">MySQL Workbench; Graphviz para diagramas de documentación</w:t>
             </w:r>
           </w:p>
         </w:tc>
@@ -4818,7 +4818,7 @@
                 <w:sz w:val="19"/>
                 <w:lang w:val="es-CO"/>
               </w:rPr>
-              <w:t xml:space="preserve">Oracle AI Database 26ai Free</w:t>
+              <w:t xml:space="preserve">MySQL 8.4 LTS (Community), administrado con MySQL Workbench</w:t>
             </w:r>
           </w:p>
         </w:tc>
@@ -4850,7 +4850,7 @@
                 <w:sz w:val="19"/>
                 <w:lang w:val="es-CO"/>
               </w:rPr>
-              <w:t xml:space="preserve">Java 21 + Servlets/JSP (Tomcat 10.1) + JDBC (driver Oracle ojdbc)</w:t>
+              <w:t xml:space="preserve">Java 21 + Servlets/JSP (Tomcat 10.1) + JDBC (MySQL Connector/J)</w:t>
             </w:r>
           </w:p>
         </w:tc>
@@ -5110,7 +5110,7 @@
                 <w:sz w:val="19"/>
                 <w:lang w:val="es-CO"/>
               </w:rPr>
-              <w:t xml:space="preserve">Edición Free de Oracle (máx. 2 GB RAM) y VM de 6 GB</w:t>
+              <w:t xml:space="preserve">MySQL consume poca memoria; VM de 6 GB</w:t>
             </w:r>
           </w:p>
         </w:tc>

</xml_diff>

<commit_message>
docs: rebuild SIGEVET models and reports with editable Draw.io diagrams
</commit_message>
<xml_diff>
--- a/documentos/fase1/01_Propuesta_del_Proyecto.docx
+++ b/documentos/fase1/01_Propuesta_del_Proyecto.docx
@@ -3946,14 +3946,14 @@
       <w:r>
         <w:drawing>
           <wp:inline>
-            <wp:extent cx="5334000" cy="5249914"/>
+            <wp:extent cx="5334000" cy="4146322"/>
             <wp:effectExtent b="0" l="0" r="0" t="0"/>
             <wp:docPr descr="Vista global del modelo (entidades y relaciones, notación Chen)" title="" id="37" name="Picture"/>
             <a:graphic>
               <a:graphicData uri="http://schemas.openxmlformats.org/drawingml/2006/picture">
                 <pic:pic>
                   <pic:nvPicPr>
-                    <pic:cNvPr descr="diagramas/png/chen_global_sin_atributos.png" id="38" name="Picture"/>
+                    <pic:cNvPr descr="diagramas/png/04_Chen_Global_191116-24Oct2026.png" id="38" name="Picture"/>
                     <pic:cNvPicPr>
                       <a:picLocks noChangeArrowheads="1" noChangeAspect="1"/>
                     </pic:cNvPicPr>
@@ -3967,7 +3967,7 @@
                   <pic:spPr bwMode="auto">
                     <a:xfrm>
                       <a:off x="0" y="0"/>
-                      <a:ext cx="5334000" cy="5249914"/>
+                      <a:ext cx="5334000" cy="4146322"/>
                     </a:xfrm>
                     <a:prstGeom prst="rect">
                       <a:avLst/>

</xml_diff>

<commit_message>
feat: aplicacion web en Spring Boot sin ORM
SQL escrito a mano con JDBC (DriverManager y PreparedStatement), clases DAO y
controladores con @GetMapping. El modelo usa herencia (Persona, Cliente, Empleado,
Veterinario, Auxiliar) y polimorfismo en la pagina de personal. La VM ya no
instala Tomcat: la app corre como servicio con java -jar. Documentos actualizados.
</commit_message>
<xml_diff>
--- a/documentos/fase1/01_Propuesta_del_Proyecto.docx
+++ b/documentos/fase1/01_Propuesta_del_Proyecto.docx
@@ -3773,7 +3773,7 @@
                 <w:sz w:val="19"/>
                 <w:lang w:val="es-CO"/>
               </w:rPr>
-              <w:t xml:space="preserve">5: DIRIGE (empleado–sede), TIENE (mascota–historia clínica), GENERA (cita–consulta) y las 2 de la especialización</w:t>
+              <w:t xml:space="preserve">5: DIRIGIR (empleado–sede), TENER (mascota–historia clínica), GENERAR (cita–consulta) y las 2 de la especialización</w:t>
             </w:r>
           </w:p>
         </w:tc>
@@ -3805,7 +3805,7 @@
                 <w:sz w:val="19"/>
                 <w:lang w:val="es-CO"/>
               </w:rPr>
-              <w:t xml:space="preserve">18, por ejemplo PROPIETARIO_DE (cliente–mascota) y CONTIENE (factura–detalle)</w:t>
+              <w:t xml:space="preserve">18, por ejemplo POSEER (cliente–mascota) y CONTENER (factura–detalle)</w:t>
             </w:r>
           </w:p>
         </w:tc>
@@ -3837,7 +3837,7 @@
                 <w:sz w:val="19"/>
                 <w:lang w:val="es-CO"/>
               </w:rPr>
-              <w:t xml:space="preserve">3: CERTIFICADO_EN (veterinario–especialidad), PRESCRIBE (consulta–medicamento) y ALMACENA (sede–medicamento)</w:t>
+              <w:t xml:space="preserve">3: CERTIFICAR (veterinario–especialidad), PRESCRIBIR (consulta–medicamento) y ALMACENAR (sede–medicamento)</w:t>
             </w:r>
           </w:p>
         </w:tc>
@@ -3946,14 +3946,14 @@
       <w:r>
         <w:drawing>
           <wp:inline>
-            <wp:extent cx="5334000" cy="4146322"/>
+            <wp:extent cx="5334000" cy="3556000"/>
             <wp:effectExtent b="0" l="0" r="0" t="0"/>
             <wp:docPr descr="Vista global del modelo (entidades y relaciones, notación Chen)" title="" id="37" name="Picture"/>
             <a:graphic>
               <a:graphicData uri="http://schemas.openxmlformats.org/drawingml/2006/picture">
                 <pic:pic>
                   <pic:nvPicPr>
-                    <pic:cNvPr descr="diagramas/png/04_Chen_Global_191116-24Oct2026.png" id="38" name="Picture"/>
+                    <pic:cNvPr descr="diagramas/png/04_Chen_Global.png" id="38" name="Picture"/>
                     <pic:cNvPicPr>
                       <a:picLocks noChangeArrowheads="1" noChangeAspect="1"/>
                     </pic:cNvPicPr>
@@ -3967,7 +3967,7 @@
                   <pic:spPr bwMode="auto">
                     <a:xfrm>
                       <a:off x="0" y="0"/>
-                      <a:ext cx="5334000" cy="4146322"/>
+                      <a:ext cx="5334000" cy="3556000"/>
                     </a:xfrm>
                     <a:prstGeom prst="rect">
                       <a:avLst/>
@@ -4850,7 +4850,7 @@
                 <w:sz w:val="19"/>
                 <w:lang w:val="es-CO"/>
               </w:rPr>
-              <w:t xml:space="preserve">Java 21 + Servlets/JSP (Tomcat 10.1) + JDBC (MySQL Connector/J)</w:t>
+              <w:t xml:space="preserve">Java 21 + Spring Boot (sin ORM) + JDBC (MySQL Connector/J)</w:t>
             </w:r>
           </w:p>
         </w:tc>

</xml_diff>

<commit_message>
docs: documentos mas compactos
</commit_message>
<xml_diff>
--- a/documentos/fase1/01_Propuesta_del_Proyecto.docx
+++ b/documentos/fase1/01_Propuesta_del_Proyecto.docx
@@ -11,7 +11,7 @@
         <w:drawing>
           <wp:inline>
             <wp:extent cx="2160000" cy="1001928"/>
-            <wp:docPr id="39" name="Picture 39"/>
+            <wp:docPr id="36" name="Picture 36"/>
             <wp:cNvGraphicFramePr>
               <a:graphicFrameLocks noChangeAspect="1"/>
             </wp:cNvGraphicFramePr>
@@ -283,72 +283,21 @@
     </w:p>
     <w:p>
       <w:pPr>
-        <w:pStyle w:val="Heading1"/>
-      </w:pPr>
-      <w:bookmarkStart w:id="19" w:name="_introducción"/>
-      <w:r>
-        <w:rPr>
-          <w:rStyle w:val="SectionNumber"/>
-          <w:lang w:val="es-CO"/>
-        </w:rPr>
-        <w:t xml:space="preserve">1</w:t>
-      </w:r>
-      <w:r>
-        <w:tab/>
-      </w:r>
-      <w:r>
-        <w:rPr>
-          <w:lang w:val="es-CO"/>
-        </w:rPr>
-        <w:t xml:space="preserve">Introducción</w:t>
-      </w:r>
-      <w:bookmarkEnd w:id="19"/>
-    </w:p>
-    <w:p>
-      <w:pPr>
         <w:pStyle w:val="FirstParagraph"/>
       </w:pPr>
-      <w:r>
-        <w:rPr>
-          <w:lang w:val="es-CO"/>
-        </w:rPr>
-        <w:t xml:space="preserve">Este documento presenta la propuesta del proyecto final de la asignatura Bases de Datos 1:</w:t>
-      </w:r>
-      <w:r>
-        <w:rPr>
-          <w:lang w:val="es-CO"/>
-        </w:rPr>
-        <w:t xml:space="preserve"> </w:t>
-      </w:r>
       <w:r>
         <w:rPr>
           <w:b/>
           <w:bCs/>
           <w:lang w:val="es-CO"/>
         </w:rPr>
-        <w:t xml:space="preserve">SIGEVET — Sistema</w:t>
-      </w:r>
-      <w:r>
-        <w:rPr>
-          <w:b/>
-          <w:bCs/>
-          <w:lang w:val="es-CO"/>
-        </w:rPr>
-        <w:t xml:space="preserve"> </w:t>
-      </w:r>
-      <w:r>
-        <w:rPr>
-          <w:b/>
-          <w:bCs/>
-          <w:lang w:val="es-CO"/>
-        </w:rPr>
-        <w:t xml:space="preserve">Integral de Gestión Veterinaria</w:t>
-      </w:r>
-      <w:r>
-        <w:rPr>
-          <w:lang w:val="es-CO"/>
-        </w:rPr>
-        <w:t xml:space="preserve">, una base de datos relacional para la Red de Clínicas Veterinarias</w:t>
+        <w:t xml:space="preserve">SIGEVET — Sistema Integral de Gestión Veterinaria</w:t>
+      </w:r>
+      <w:r>
+        <w:rPr>
+          <w:lang w:val="es-CO"/>
+        </w:rPr>
+        <w:t xml:space="preserve">: base relacional para</w:t>
       </w:r>
       <w:r>
         <w:rPr>
@@ -362,60 +311,26 @@
           <w:iCs/>
           <w:lang w:val="es-CO"/>
         </w:rPr>
-        <w:t xml:space="preserve">Huella Sana</w:t>
-      </w:r>
-      <w:r>
-        <w:rPr>
-          <w:i/>
-          <w:iCs/>
-          <w:lang w:val="es-CO"/>
-        </w:rPr>
-        <w:t xml:space="preserve"> </w:t>
-      </w:r>
-      <w:r>
-        <w:rPr>
-          <w:i/>
-          <w:iCs/>
-          <w:lang w:val="es-CO"/>
-        </w:rPr>
-        <w:t xml:space="preserve">S.A.S.</w:t>
-      </w:r>
-      <w:r>
-        <w:rPr>
-          <w:lang w:val="es-CO"/>
-        </w:rPr>
-        <w:t xml:space="preserve"> </w:t>
-      </w:r>
-      <w:r>
-        <w:rPr>
-          <w:lang w:val="es-CO"/>
-        </w:rPr>
-        <w:t xml:space="preserve">(caso simulado). La propuesta describe la organización, la problemática, los objetivos, el alcance y los</w:t>
-      </w:r>
-      <w:r>
-        <w:rPr>
-          <w:lang w:val="es-CO"/>
-        </w:rPr>
-        <w:t xml:space="preserve"> </w:t>
-      </w:r>
-      <w:r>
-        <w:rPr>
-          <w:lang w:val="es-CO"/>
-        </w:rPr>
-        <w:t xml:space="preserve">requerimientos del sistema, y servirá como guía para el modelado (Fase 1) y la implementación (Fase 2).</w:t>
+        <w:t xml:space="preserve">Huella Sana S.A.S.</w:t>
+      </w:r>
+      <w:r>
+        <w:rPr>
+          <w:lang w:val="es-CO"/>
+        </w:rPr>
+        <w:t xml:space="preserve">, caso simulado de Bases de Datos 1.</w:t>
       </w:r>
     </w:p>
     <w:p>
       <w:pPr>
         <w:pStyle w:val="Heading1"/>
       </w:pPr>
-      <w:bookmarkStart w:id="20" w:name="_f439a9a3af015bf753ac5092a54a828bc5a986d"/>
+      <w:bookmarkStart w:id="19" w:name="_organización"/>
       <w:r>
         <w:rPr>
           <w:rStyle w:val="SectionNumber"/>
           <w:lang w:val="es-CO"/>
         </w:rPr>
-        <w:t xml:space="preserve">2</w:t>
+        <w:t xml:space="preserve">1</w:t>
       </w:r>
       <w:r>
         <w:tab/>
@@ -424,9 +339,9 @@
         <w:rPr>
           <w:lang w:val="es-CO"/>
         </w:rPr>
-        <w:t xml:space="preserve">Descripción de la organización</w:t>
-      </w:r>
-      <w:bookmarkEnd w:id="20"/>
+        <w:t xml:space="preserve">Organización</w:t>
+      </w:r>
+      <w:bookmarkEnd w:id="19"/>
     </w:p>
     <w:p>
       <w:pPr>
@@ -434,55 +349,9 @@
       </w:pPr>
       <w:r>
         <w:rPr>
-          <w:i/>
-          <w:iCs/>
-          <w:lang w:val="es-CO"/>
-        </w:rPr>
-        <w:t xml:space="preserve">Huella Sana S.A.S.</w:t>
-      </w:r>
-      <w:r>
-        <w:rPr>
-          <w:lang w:val="es-CO"/>
-        </w:rPr>
-        <w:t xml:space="preserve"> </w:t>
-      </w:r>
-      <w:r>
-        <w:rPr>
-          <w:lang w:val="es-CO"/>
-        </w:rPr>
-        <w:t xml:space="preserve">es una red de clínicas veterinarias de pequeños animales fundada en 2018 en Bogotá. Hoy opera</w:t>
-      </w:r>
-      <w:r>
-        <w:rPr>
-          <w:lang w:val="es-CO"/>
-        </w:rPr>
-        <w:t xml:space="preserve"> </w:t>
-      </w:r>
-      <w:r>
-        <w:rPr>
-          <w:b/>
-          <w:bCs/>
-          <w:lang w:val="es-CO"/>
-        </w:rPr>
-        <w:t xml:space="preserve">cinco sedes</w:t>
-      </w:r>
-      <w:r>
-        <w:rPr>
-          <w:lang w:val="es-CO"/>
-        </w:rPr>
-        <w:t xml:space="preserve">: Usaquén y Chapinero (Bogotá D.C.), Chía (Cundinamarca), Laureles (Medellín) y San Fernando (Cali).</w:t>
-      </w:r>
-      <w:r>
-        <w:rPr>
-          <w:lang w:val="es-CO"/>
-        </w:rPr>
-        <w:t xml:space="preserve"> </w:t>
-      </w:r>
-      <w:r>
-        <w:rPr>
-          <w:lang w:val="es-CO"/>
-        </w:rPr>
-        <w:t xml:space="preserve">Atiende principalmente perros y gatos, y en menor proporción aves, conejos y hámsteres.</w:t>
+          <w:lang w:val="es-CO"/>
+        </w:rPr>
+        <w:t xml:space="preserve">Fundada en Bogotá, 2018. Atiende perros/gatos/aves/conejos/hámsteres. Sedes: Usaquén y Chapinero (Bogotá D.C.), Chía (Cundinamarca), Laureles (Medellín), San Fernando (Cali).</w:t>
       </w:r>
     </w:p>
     <w:p>
@@ -493,7 +362,7 @@
         <w:rPr>
           <w:lang w:val="es-CO"/>
         </w:rPr>
-        <w:t xml:space="preserve">Caracterización general de la organización</w:t>
+        <w:t xml:space="preserve">Organización</w:t>
       </w:r>
     </w:p>
     <w:tbl>
@@ -502,7 +371,7 @@
         <w:tblW w:type="pct" w:w="5000"/>
         <w:tblLayout w:type="fixed"/>
         <w:tblLook w:firstRow="1" w:lastRow="0" w:firstColumn="0" w:lastColumn="0" w:noHBand="0" w:noVBand="0" w:val="0020"/>
-        <w:tblCaption w:val="Caracterización general de la organización"/>
+        <w:tblCaption w:val="Organización"/>
         <w:tblBorders>
           <w:top w:val="single" w:sz="4" w:color="A6A6A6"/>
           <w:left w:val="single" w:sz="4" w:color="A6A6A6"/>
@@ -584,7 +453,7 @@
                 <w:sz w:val="19"/>
                 <w:lang w:val="es-CO"/>
               </w:rPr>
-              <w:t xml:space="preserve">5 clínicas en 4 ciudades, cada una con un director</w:t>
+              <w:t xml:space="preserve">5 clínicas, 4 ciudades, director por sede</w:t>
             </w:r>
           </w:p>
         </w:tc>
@@ -616,7 +485,7 @@
                 <w:sz w:val="19"/>
                 <w:lang w:val="es-CO"/>
               </w:rPr>
-              <w:t xml:space="preserve">27 empleados: veterinarios, auxiliares veterinarios y personal administrativo</w:t>
+              <w:t xml:space="preserve">27 empleados: veterinarios, auxiliares, administrativos</w:t>
             </w:r>
           </w:p>
         </w:tc>
@@ -648,7 +517,7 @@
                 <w:sz w:val="19"/>
                 <w:lang w:val="es-CO"/>
               </w:rPr>
-              <w:t xml:space="preserve">Propietarios de mascotas que pueden ser atendidos en cualquier sede</w:t>
+              <w:t xml:space="preserve">Propietarios atendidos en cualquier sede</w:t>
             </w:r>
           </w:p>
         </w:tc>
@@ -712,7 +581,7 @@
                 <w:sz w:val="19"/>
                 <w:lang w:val="es-CO"/>
               </w:rPr>
-              <w:t xml:space="preserve">Medicamentos e insumos veterinarios vendidos con o sin fórmula médica</w:t>
+              <w:t xml:space="preserve">Medicamentos e insumos con/sin fórmula</w:t>
             </w:r>
           </w:p>
         </w:tc>
@@ -722,13 +591,13 @@
       <w:pPr>
         <w:pStyle w:val="Heading1"/>
       </w:pPr>
-      <w:bookmarkStart w:id="21" w:name="_d5a9784d35204318fe86ce8f55283e2bf7bab52"/>
+      <w:bookmarkStart w:id="20" w:name="_problema"/>
       <w:r>
         <w:rPr>
           <w:rStyle w:val="SectionNumber"/>
           <w:lang w:val="es-CO"/>
         </w:rPr>
-        <w:t xml:space="preserve">3</w:t>
+        <w:t xml:space="preserve">2</w:t>
       </w:r>
       <w:r>
         <w:tab/>
@@ -737,90 +606,9 @@
         <w:rPr>
           <w:lang w:val="es-CO"/>
         </w:rPr>
-        <w:t xml:space="preserve">Planteamiento del problema</w:t>
-      </w:r>
-      <w:bookmarkEnd w:id="21"/>
-    </w:p>
-    <w:p>
-      <w:pPr>
-        <w:pStyle w:val="Heading2"/>
-      </w:pPr>
-      <w:bookmarkStart w:id="22" w:name="_c7c80263656f21309c2ae3aa0e9cf238fc057b0"/>
-      <w:r>
-        <w:rPr>
-          <w:rStyle w:val="SectionNumber"/>
-          <w:lang w:val="es-CO"/>
-        </w:rPr>
-        <w:t xml:space="preserve">3.1</w:t>
-      </w:r>
-      <w:r>
-        <w:tab/>
-      </w:r>
-      <w:r>
-        <w:rPr>
-          <w:lang w:val="es-CO"/>
-        </w:rPr>
-        <w:t xml:space="preserve">Situación actual</w:t>
-      </w:r>
-      <w:bookmarkEnd w:id="22"/>
-    </w:p>
-    <w:p>
-      <w:pPr>
-        <w:pStyle w:val="FirstParagraph"/>
-      </w:pPr>
-      <w:r>
-        <w:rPr>
-          <w:lang w:val="es-CO"/>
-        </w:rPr>
-        <w:t xml:space="preserve">Cada sede administra su información de forma independiente: las agendas se llevan en hojas de cálculo, las</w:t>
-      </w:r>
-      <w:r>
-        <w:rPr>
-          <w:lang w:val="es-CO"/>
-        </w:rPr>
-        <w:t xml:space="preserve"> </w:t>
-      </w:r>
-      <w:r>
-        <w:rPr>
-          <w:lang w:val="es-CO"/>
-        </w:rPr>
-        <w:t xml:space="preserve">historias clínicas se guardan en carpetas físicas, el inventario de medicamentos se cuenta a mano y la facturación se</w:t>
-      </w:r>
-      <w:r>
-        <w:rPr>
-          <w:lang w:val="es-CO"/>
-        </w:rPr>
-        <w:t xml:space="preserve"> </w:t>
-      </w:r>
-      <w:r>
-        <w:rPr>
-          <w:lang w:val="es-CO"/>
-        </w:rPr>
-        <w:t xml:space="preserve">hace en un programa de escritorio distinto en cada sede. No existe una fuente única de información para la red.</w:t>
-      </w:r>
-    </w:p>
-    <w:p>
-      <w:pPr>
-        <w:pStyle w:val="Heading2"/>
-      </w:pPr>
-      <w:bookmarkStart w:id="23" w:name="_57f07c9426f2656886112a1d0e65667801aac88"/>
-      <w:r>
-        <w:rPr>
-          <w:rStyle w:val="SectionNumber"/>
-          <w:lang w:val="es-CO"/>
-        </w:rPr>
-        <w:t xml:space="preserve">3.2</w:t>
-      </w:r>
-      <w:r>
-        <w:tab/>
-      </w:r>
-      <w:r>
-        <w:rPr>
-          <w:lang w:val="es-CO"/>
-        </w:rPr>
-        <w:t xml:space="preserve">Síntomas, causas y consecuencias</w:t>
-      </w:r>
-      <w:bookmarkEnd w:id="23"/>
+        <w:t xml:space="preserve">Problema</w:t>
+      </w:r>
+      <w:bookmarkEnd w:id="20"/>
     </w:p>
     <w:p>
       <w:pPr>
@@ -830,7 +618,7 @@
         <w:rPr>
           <w:lang w:val="es-CO"/>
         </w:rPr>
-        <w:t xml:space="preserve">Análisis de la problemática</w:t>
+        <w:t xml:space="preserve">Problemática</w:t>
       </w:r>
     </w:p>
     <w:tbl>
@@ -839,7 +627,7 @@
         <w:tblW w:type="pct" w:w="5000"/>
         <w:tblLayout w:type="fixed"/>
         <w:tblLook w:firstRow="1" w:lastRow="0" w:firstColumn="0" w:lastColumn="0" w:noHBand="0" w:noVBand="0" w:val="0020"/>
-        <w:tblCaption w:val="Análisis de la problemática"/>
+        <w:tblCaption w:val="Problemática"/>
         <w:tblBorders>
           <w:top w:val="single" w:sz="4" w:color="A6A6A6"/>
           <w:left w:val="single" w:sz="4" w:color="A6A6A6"/>
@@ -925,225 +713,225 @@
                 <w:sz w:val="19"/>
                 <w:lang w:val="es-CO"/>
               </w:rPr>
-              <w:t xml:space="preserve">Citas duplicadas o cruzadas para un mismo veterinario</w:t>
-            </w:r>
-          </w:p>
-        </w:tc>
-        <w:tc>
-          <w:tcPr/>
-          <w:p>
-            <w:pPr>
-              <w:pStyle w:val="Compact"/>
-            </w:pPr>
-            <w:r>
-              <w:rPr>
-                <w:sz w:val="19"/>
-                <w:lang w:val="es-CO"/>
-              </w:rPr>
-              <w:t xml:space="preserve">Agendas en archivos separados sin validación</w:t>
-            </w:r>
-          </w:p>
-        </w:tc>
-        <w:tc>
-          <w:tcPr/>
-          <w:p>
-            <w:pPr>
-              <w:pStyle w:val="Compact"/>
-            </w:pPr>
-            <w:r>
-              <w:rPr>
-                <w:sz w:val="19"/>
-                <w:lang w:val="es-CO"/>
-              </w:rPr>
-              <w:t xml:space="preserve">Clientes inconformes y tiempos muertos</w:t>
-            </w:r>
-          </w:p>
-        </w:tc>
-      </w:tr>
-      <w:tr>
-        <w:tc>
-          <w:tcPr/>
-          <w:p>
-            <w:pPr>
-              <w:pStyle w:val="Compact"/>
-            </w:pPr>
-            <w:r>
-              <w:rPr>
-                <w:sz w:val="19"/>
-                <w:lang w:val="es-CO"/>
-              </w:rPr>
-              <w:t xml:space="preserve">Historia clínica incompleta cuando la mascota va a otra sede</w:t>
-            </w:r>
-          </w:p>
-        </w:tc>
-        <w:tc>
-          <w:tcPr/>
-          <w:p>
-            <w:pPr>
-              <w:pStyle w:val="Compact"/>
-            </w:pPr>
-            <w:r>
-              <w:rPr>
-                <w:sz w:val="19"/>
-                <w:lang w:val="es-CO"/>
-              </w:rPr>
-              <w:t xml:space="preserve">Historias en papel, una carpeta por sede</w:t>
-            </w:r>
-          </w:p>
-        </w:tc>
-        <w:tc>
-          <w:tcPr/>
-          <w:p>
-            <w:pPr>
-              <w:pStyle w:val="Compact"/>
-            </w:pPr>
-            <w:r>
-              <w:rPr>
-                <w:sz w:val="19"/>
-                <w:lang w:val="es-CO"/>
-              </w:rPr>
-              <w:t xml:space="preserve">Riesgo clínico: alergias y tratamientos previos desconocidos</w:t>
-            </w:r>
-          </w:p>
-        </w:tc>
-      </w:tr>
-      <w:tr>
-        <w:tc>
-          <w:tcPr/>
-          <w:p>
-            <w:pPr>
-              <w:pStyle w:val="Compact"/>
-            </w:pPr>
-            <w:r>
-              <w:rPr>
-                <w:sz w:val="19"/>
-                <w:lang w:val="es-CO"/>
-              </w:rPr>
-              <w:t xml:space="preserve">Medicamentos agotados o con sobrestock</w:t>
-            </w:r>
-          </w:p>
-        </w:tc>
-        <w:tc>
-          <w:tcPr/>
-          <w:p>
-            <w:pPr>
-              <w:pStyle w:val="Compact"/>
-            </w:pPr>
-            <w:r>
-              <w:rPr>
-                <w:sz w:val="19"/>
-                <w:lang w:val="es-CO"/>
-              </w:rPr>
-              <w:t xml:space="preserve">No hay control de stock mínimo por sede</w:t>
-            </w:r>
-          </w:p>
-        </w:tc>
-        <w:tc>
-          <w:tcPr/>
-          <w:p>
-            <w:pPr>
-              <w:pStyle w:val="Compact"/>
-            </w:pPr>
-            <w:r>
-              <w:rPr>
-                <w:sz w:val="19"/>
-                <w:lang w:val="es-CO"/>
-              </w:rPr>
-              <w:t xml:space="preserve">Ventas perdidas y capital inmovilizado</w:t>
-            </w:r>
-          </w:p>
-        </w:tc>
-      </w:tr>
-      <w:tr>
-        <w:tc>
-          <w:tcPr/>
-          <w:p>
-            <w:pPr>
-              <w:pStyle w:val="Compact"/>
-            </w:pPr>
-            <w:r>
-              <w:rPr>
-                <w:sz w:val="19"/>
-                <w:lang w:val="es-CO"/>
-              </w:rPr>
-              <w:t xml:space="preserve">Datos de clientes repetidos y contradictorios</w:t>
-            </w:r>
-          </w:p>
-        </w:tc>
-        <w:tc>
-          <w:tcPr/>
-          <w:p>
-            <w:pPr>
-              <w:pStyle w:val="Compact"/>
-            </w:pPr>
-            <w:r>
-              <w:rPr>
-                <w:sz w:val="19"/>
-                <w:lang w:val="es-CO"/>
-              </w:rPr>
-              <w:t xml:space="preserve">Cada sede registra al cliente de nuevo</w:t>
-            </w:r>
-          </w:p>
-        </w:tc>
-        <w:tc>
-          <w:tcPr/>
-          <w:p>
-            <w:pPr>
-              <w:pStyle w:val="Compact"/>
-            </w:pPr>
-            <w:r>
-              <w:rPr>
-                <w:sz w:val="19"/>
-                <w:lang w:val="es-CO"/>
-              </w:rPr>
-              <w:t xml:space="preserve">Redundancia, anomalías de actualización</w:t>
-            </w:r>
-          </w:p>
-        </w:tc>
-      </w:tr>
-      <w:tr>
-        <w:tc>
-          <w:tcPr/>
-          <w:p>
-            <w:pPr>
-              <w:pStyle w:val="Compact"/>
-            </w:pPr>
-            <w:r>
-              <w:rPr>
-                <w:sz w:val="19"/>
-                <w:lang w:val="es-CO"/>
-              </w:rPr>
-              <w:t xml:space="preserve">La gerencia no conoce ingresos por sede ni por servicio</w:t>
-            </w:r>
-          </w:p>
-        </w:tc>
-        <w:tc>
-          <w:tcPr/>
-          <w:p>
-            <w:pPr>
-              <w:pStyle w:val="Compact"/>
-            </w:pPr>
-            <w:r>
-              <w:rPr>
-                <w:sz w:val="19"/>
-                <w:lang w:val="es-CO"/>
-              </w:rPr>
-              <w:t xml:space="preserve">Facturación sin integración</w:t>
-            </w:r>
-          </w:p>
-        </w:tc>
-        <w:tc>
-          <w:tcPr/>
-          <w:p>
-            <w:pPr>
-              <w:pStyle w:val="Compact"/>
-            </w:pPr>
-            <w:r>
-              <w:rPr>
-                <w:sz w:val="19"/>
-                <w:lang w:val="es-CO"/>
-              </w:rPr>
-              <w:t xml:space="preserve">Decisiones sin datos confiables</w:t>
+              <w:t xml:space="preserve">Citas cruzadas</w:t>
+            </w:r>
+          </w:p>
+        </w:tc>
+        <w:tc>
+          <w:tcPr/>
+          <w:p>
+            <w:pPr>
+              <w:pStyle w:val="Compact"/>
+            </w:pPr>
+            <w:r>
+              <w:rPr>
+                <w:sz w:val="19"/>
+                <w:lang w:val="es-CO"/>
+              </w:rPr>
+              <w:t xml:space="preserve">Agendas separadas sin validación</w:t>
+            </w:r>
+          </w:p>
+        </w:tc>
+        <w:tc>
+          <w:tcPr/>
+          <w:p>
+            <w:pPr>
+              <w:pStyle w:val="Compact"/>
+            </w:pPr>
+            <w:r>
+              <w:rPr>
+                <w:sz w:val="19"/>
+                <w:lang w:val="es-CO"/>
+              </w:rPr>
+              <w:t xml:space="preserve">Inconformidad, tiempos muertos</w:t>
+            </w:r>
+          </w:p>
+        </w:tc>
+      </w:tr>
+      <w:tr>
+        <w:tc>
+          <w:tcPr/>
+          <w:p>
+            <w:pPr>
+              <w:pStyle w:val="Compact"/>
+            </w:pPr>
+            <w:r>
+              <w:rPr>
+                <w:sz w:val="19"/>
+                <w:lang w:val="es-CO"/>
+              </w:rPr>
+              <w:t xml:space="preserve">Historia incompleta entre sedes</w:t>
+            </w:r>
+          </w:p>
+        </w:tc>
+        <w:tc>
+          <w:tcPr/>
+          <w:p>
+            <w:pPr>
+              <w:pStyle w:val="Compact"/>
+            </w:pPr>
+            <w:r>
+              <w:rPr>
+                <w:sz w:val="19"/>
+                <w:lang w:val="es-CO"/>
+              </w:rPr>
+              <w:t xml:space="preserve">Carpetas separadas</w:t>
+            </w:r>
+          </w:p>
+        </w:tc>
+        <w:tc>
+          <w:tcPr/>
+          <w:p>
+            <w:pPr>
+              <w:pStyle w:val="Compact"/>
+            </w:pPr>
+            <w:r>
+              <w:rPr>
+                <w:sz w:val="19"/>
+                <w:lang w:val="es-CO"/>
+              </w:rPr>
+              <w:t xml:space="preserve">Alergias/tratamientos desconocidos</w:t>
+            </w:r>
+          </w:p>
+        </w:tc>
+      </w:tr>
+      <w:tr>
+        <w:tc>
+          <w:tcPr/>
+          <w:p>
+            <w:pPr>
+              <w:pStyle w:val="Compact"/>
+            </w:pPr>
+            <w:r>
+              <w:rPr>
+                <w:sz w:val="19"/>
+                <w:lang w:val="es-CO"/>
+              </w:rPr>
+              <w:t xml:space="preserve">Agotados/sobrestock</w:t>
+            </w:r>
+          </w:p>
+        </w:tc>
+        <w:tc>
+          <w:tcPr/>
+          <w:p>
+            <w:pPr>
+              <w:pStyle w:val="Compact"/>
+            </w:pPr>
+            <w:r>
+              <w:rPr>
+                <w:sz w:val="19"/>
+                <w:lang w:val="es-CO"/>
+              </w:rPr>
+              <w:t xml:space="preserve">Sin stock mínimo</w:t>
+            </w:r>
+          </w:p>
+        </w:tc>
+        <w:tc>
+          <w:tcPr/>
+          <w:p>
+            <w:pPr>
+              <w:pStyle w:val="Compact"/>
+            </w:pPr>
+            <w:r>
+              <w:rPr>
+                <w:sz w:val="19"/>
+                <w:lang w:val="es-CO"/>
+              </w:rPr>
+              <w:t xml:space="preserve">Ventas perdidas, capital inmovilizado</w:t>
+            </w:r>
+          </w:p>
+        </w:tc>
+      </w:tr>
+      <w:tr>
+        <w:tc>
+          <w:tcPr/>
+          <w:p>
+            <w:pPr>
+              <w:pStyle w:val="Compact"/>
+            </w:pPr>
+            <w:r>
+              <w:rPr>
+                <w:sz w:val="19"/>
+                <w:lang w:val="es-CO"/>
+              </w:rPr>
+              <w:t xml:space="preserve">Clientes duplicados</w:t>
+            </w:r>
+          </w:p>
+        </w:tc>
+        <w:tc>
+          <w:tcPr/>
+          <w:p>
+            <w:pPr>
+              <w:pStyle w:val="Compact"/>
+            </w:pPr>
+            <w:r>
+              <w:rPr>
+                <w:sz w:val="19"/>
+                <w:lang w:val="es-CO"/>
+              </w:rPr>
+              <w:t xml:space="preserve">Registro por sede</w:t>
+            </w:r>
+          </w:p>
+        </w:tc>
+        <w:tc>
+          <w:tcPr/>
+          <w:p>
+            <w:pPr>
+              <w:pStyle w:val="Compact"/>
+            </w:pPr>
+            <w:r>
+              <w:rPr>
+                <w:sz w:val="19"/>
+                <w:lang w:val="es-CO"/>
+              </w:rPr>
+              <w:t xml:space="preserve">Anomalías de actualización</w:t>
+            </w:r>
+          </w:p>
+        </w:tc>
+      </w:tr>
+      <w:tr>
+        <w:tc>
+          <w:tcPr/>
+          <w:p>
+            <w:pPr>
+              <w:pStyle w:val="Compact"/>
+            </w:pPr>
+            <w:r>
+              <w:rPr>
+                <w:sz w:val="19"/>
+                <w:lang w:val="es-CO"/>
+              </w:rPr>
+              <w:t xml:space="preserve">Ingresos por sede/servicio desconocidos</w:t>
+            </w:r>
+          </w:p>
+        </w:tc>
+        <w:tc>
+          <w:tcPr/>
+          <w:p>
+            <w:pPr>
+              <w:pStyle w:val="Compact"/>
+            </w:pPr>
+            <w:r>
+              <w:rPr>
+                <w:sz w:val="19"/>
+                <w:lang w:val="es-CO"/>
+              </w:rPr>
+              <w:t xml:space="preserve">Facturación separada</w:t>
+            </w:r>
+          </w:p>
+        </w:tc>
+        <w:tc>
+          <w:tcPr/>
+          <w:p>
+            <w:pPr>
+              <w:pStyle w:val="Compact"/>
+            </w:pPr>
+            <w:r>
+              <w:rPr>
+                <w:sz w:val="19"/>
+                <w:lang w:val="es-CO"/>
+              </w:rPr>
+              <w:t xml:space="preserve">Decisiones sin datos</w:t>
             </w:r>
           </w:p>
         </w:tc>
@@ -1153,13 +941,13 @@
       <w:pPr>
         <w:pStyle w:val="Heading2"/>
       </w:pPr>
-      <w:bookmarkStart w:id="24" w:name="_333336f53fdcdcf68ef50dd6d6aeb5c81ac4d80"/>
+      <w:bookmarkStart w:id="21" w:name="_pregunta"/>
       <w:r>
         <w:rPr>
           <w:rStyle w:val="SectionNumber"/>
           <w:lang w:val="es-CO"/>
         </w:rPr>
-        <w:t xml:space="preserve">3.3</w:t>
+        <w:t xml:space="preserve">2.1</w:t>
       </w:r>
       <w:r>
         <w:tab/>
@@ -1168,7 +956,98 @@
         <w:rPr>
           <w:lang w:val="es-CO"/>
         </w:rPr>
-        <w:t xml:space="preserve">Pregunta problema</w:t>
+        <w:t xml:space="preserve">Pregunta</w:t>
+      </w:r>
+      <w:bookmarkEnd w:id="21"/>
+    </w:p>
+    <w:p>
+      <w:pPr>
+        <w:pStyle w:val="FirstParagraph"/>
+      </w:pPr>
+      <w:r>
+        <w:rPr>
+          <w:lang w:val="es-CO"/>
+        </w:rPr>
+        <w:t xml:space="preserve">¿Cómo centralizar cinco sedes en una base clínica, operativa y comercial 3FN consultable por web?</w:t>
+      </w:r>
+    </w:p>
+    <w:p>
+      <w:pPr>
+        <w:pStyle w:val="Heading1"/>
+      </w:pPr>
+      <w:bookmarkStart w:id="22" w:name="_justificación"/>
+      <w:r>
+        <w:rPr>
+          <w:rStyle w:val="SectionNumber"/>
+          <w:lang w:val="es-CO"/>
+        </w:rPr>
+        <w:t xml:space="preserve">3</w:t>
+      </w:r>
+      <w:r>
+        <w:tab/>
+      </w:r>
+      <w:r>
+        <w:rPr>
+          <w:lang w:val="es-CO"/>
+        </w:rPr>
+        <w:t xml:space="preserve">Justificación</w:t>
+      </w:r>
+      <w:bookmarkEnd w:id="22"/>
+    </w:p>
+    <w:p>
+      <w:pPr>
+        <w:pStyle w:val="FirstParagraph"/>
+      </w:pPr>
+      <w:r>
+        <w:rPr>
+          <w:lang w:val="es-CO"/>
+        </w:rPr>
+        <w:t xml:space="preserve">Centralizar reduce duplicados y controla integridad; aplica modelado, especialización, normalización y consultas sobre Linux.</w:t>
+      </w:r>
+    </w:p>
+    <w:p>
+      <w:pPr>
+        <w:pStyle w:val="Heading1"/>
+      </w:pPr>
+      <w:bookmarkStart w:id="23" w:name="_objetivos"/>
+      <w:r>
+        <w:rPr>
+          <w:rStyle w:val="SectionNumber"/>
+          <w:lang w:val="es-CO"/>
+        </w:rPr>
+        <w:t xml:space="preserve">4</w:t>
+      </w:r>
+      <w:r>
+        <w:tab/>
+      </w:r>
+      <w:r>
+        <w:rPr>
+          <w:lang w:val="es-CO"/>
+        </w:rPr>
+        <w:t xml:space="preserve">Objetivos</w:t>
+      </w:r>
+      <w:bookmarkEnd w:id="23"/>
+    </w:p>
+    <w:p>
+      <w:pPr>
+        <w:pStyle w:val="Heading2"/>
+      </w:pPr>
+      <w:bookmarkStart w:id="24" w:name="_general"/>
+      <w:r>
+        <w:rPr>
+          <w:rStyle w:val="SectionNumber"/>
+          <w:lang w:val="es-CO"/>
+        </w:rPr>
+        <w:t xml:space="preserve">4.1</w:t>
+      </w:r>
+      <w:r>
+        <w:tab/>
+      </w:r>
+      <w:r>
+        <w:rPr>
+          <w:lang w:val="es-CO"/>
+        </w:rPr>
+        <w:t xml:space="preserve">General</w:t>
       </w:r>
       <w:bookmarkEnd w:id="24"/>
     </w:p>
@@ -1180,70 +1059,20 @@
         <w:rPr>
           <w:lang w:val="es-CO"/>
         </w:rPr>
-        <w:t xml:space="preserve">¿Cómo diseñar e implementar una base de datos relacional centralizada, normalizada hasta la Tercera Forma Normal, que</w:t>
-      </w:r>
-      <w:r>
-        <w:rPr>
-          <w:lang w:val="es-CO"/>
-        </w:rPr>
-        <w:t xml:space="preserve"> </w:t>
-      </w:r>
-      <w:r>
-        <w:rPr>
-          <w:lang w:val="es-CO"/>
-        </w:rPr>
-        <w:t xml:space="preserve">integre la información clínica, operativa y comercial de las cinco sedes de</w:t>
-      </w:r>
-      <w:r>
-        <w:rPr>
-          <w:lang w:val="es-CO"/>
-        </w:rPr>
-        <w:t xml:space="preserve"> </w:t>
-      </w:r>
-      <w:r>
-        <w:rPr>
-          <w:i/>
-          <w:iCs/>
-          <w:lang w:val="es-CO"/>
-        </w:rPr>
-        <w:t xml:space="preserve">Huella Sana</w:t>
-      </w:r>
-      <w:r>
-        <w:rPr>
-          <w:lang w:val="es-CO"/>
-        </w:rPr>
-        <w:t xml:space="preserve"> </w:t>
-      </w:r>
-      <w:r>
-        <w:rPr>
-          <w:lang w:val="es-CO"/>
-        </w:rPr>
-        <w:t xml:space="preserve">y permita consultarla de</w:t>
-      </w:r>
-      <w:r>
-        <w:rPr>
-          <w:lang w:val="es-CO"/>
-        </w:rPr>
-        <w:t xml:space="preserve"> </w:t>
-      </w:r>
-      <w:r>
-        <w:rPr>
-          <w:lang w:val="es-CO"/>
-        </w:rPr>
-        <w:t xml:space="preserve">forma confiable desde una aplicación web?</w:t>
-      </w:r>
-    </w:p>
-    <w:p>
-      <w:pPr>
-        <w:pStyle w:val="Heading1"/>
-      </w:pPr>
-      <w:bookmarkStart w:id="25" w:name="_justificación"/>
+        <w:t xml:space="preserve">Diseñar e implementar SIGEVET: modelo conceptual, MySQL en VM Oracle Linux y consulta web.</w:t>
+      </w:r>
+    </w:p>
+    <w:p>
+      <w:pPr>
+        <w:pStyle w:val="Heading2"/>
+      </w:pPr>
+      <w:bookmarkStart w:id="25" w:name="_específicos"/>
       <w:r>
         <w:rPr>
           <w:rStyle w:val="SectionNumber"/>
           <w:lang w:val="es-CO"/>
         </w:rPr>
-        <w:t xml:space="preserve">4</w:t>
+        <w:t xml:space="preserve">4.2</w:t>
       </w:r>
       <w:r>
         <w:tab/>
@@ -1252,192 +1081,9 @@
         <w:rPr>
           <w:lang w:val="es-CO"/>
         </w:rPr>
-        <w:t xml:space="preserve">Justificación</w:t>
+        <w:t xml:space="preserve">Específicos</w:t>
       </w:r>
       <w:bookmarkEnd w:id="25"/>
-    </w:p>
-    <w:p>
-      <w:pPr>
-        <w:pStyle w:val="FirstParagraph"/>
-      </w:pPr>
-      <w:r>
-        <w:rPr>
-          <w:lang w:val="es-CO"/>
-        </w:rPr>
-        <w:t xml:space="preserve">Una base de datos relacional centralizada elimina la redundancia (un cliente y una mascota se registran una sola</w:t>
-      </w:r>
-      <w:r>
-        <w:rPr>
-          <w:lang w:val="es-CO"/>
-        </w:rPr>
-        <w:t xml:space="preserve"> </w:t>
-      </w:r>
-      <w:r>
-        <w:rPr>
-          <w:lang w:val="es-CO"/>
-        </w:rPr>
-        <w:t xml:space="preserve">vez), garantiza la integridad de los datos mediante llaves primarias, foráneas y restricciones, y permite responder</w:t>
-      </w:r>
-      <w:r>
-        <w:rPr>
-          <w:lang w:val="es-CO"/>
-        </w:rPr>
-        <w:t xml:space="preserve"> </w:t>
-      </w:r>
-      <w:r>
-        <w:rPr>
-          <w:lang w:val="es-CO"/>
-        </w:rPr>
-        <w:t xml:space="preserve">preguntas de negocio con consultas declarativas (álgebra relacional y SQL). Para la asignatura, el caso es apropiado</w:t>
-      </w:r>
-      <w:r>
-        <w:rPr>
-          <w:lang w:val="es-CO"/>
-        </w:rPr>
-        <w:t xml:space="preserve"> </w:t>
-      </w:r>
-      <w:r>
-        <w:rPr>
-          <w:lang w:val="es-CO"/>
-        </w:rPr>
-        <w:t xml:space="preserve">porque exige todos los conceptos del curso: modelo entidad-relación con más de ocho entidades y relaciones 1:1, 1:N y</w:t>
-      </w:r>
-      <w:r>
-        <w:rPr>
-          <w:lang w:val="es-CO"/>
-        </w:rPr>
-        <w:t xml:space="preserve"> </w:t>
-      </w:r>
-      <w:r>
-        <w:rPr>
-          <w:lang w:val="es-CO"/>
-        </w:rPr>
-        <w:t xml:space="preserve">N:M, especialización (modelo extendido), normalización hasta 3FN, consultas con uniones, selecciones y proyecciones,</w:t>
-      </w:r>
-      <w:r>
-        <w:rPr>
-          <w:lang w:val="es-CO"/>
-        </w:rPr>
-        <w:t xml:space="preserve"> </w:t>
-      </w:r>
-      <w:r>
-        <w:rPr>
-          <w:lang w:val="es-CO"/>
-        </w:rPr>
-        <w:t xml:space="preserve">y una implementación real en un RDBMS sobre una máquina virtual Linux con acceso desde una aplicación web.</w:t>
-      </w:r>
-    </w:p>
-    <w:p>
-      <w:pPr>
-        <w:pStyle w:val="Heading1"/>
-      </w:pPr>
-      <w:bookmarkStart w:id="26" w:name="_objetivos"/>
-      <w:r>
-        <w:rPr>
-          <w:rStyle w:val="SectionNumber"/>
-          <w:lang w:val="es-CO"/>
-        </w:rPr>
-        <w:t xml:space="preserve">5</w:t>
-      </w:r>
-      <w:r>
-        <w:tab/>
-      </w:r>
-      <w:r>
-        <w:rPr>
-          <w:lang w:val="es-CO"/>
-        </w:rPr>
-        <w:t xml:space="preserve">Objetivos</w:t>
-      </w:r>
-      <w:bookmarkEnd w:id="26"/>
-    </w:p>
-    <w:p>
-      <w:pPr>
-        <w:pStyle w:val="Heading2"/>
-      </w:pPr>
-      <w:bookmarkStart w:id="27" w:name="_c64fb550c3e89cc8e7ce1cbb90cf5a950e7566d"/>
-      <w:r>
-        <w:rPr>
-          <w:rStyle w:val="SectionNumber"/>
-          <w:lang w:val="es-CO"/>
-        </w:rPr>
-        <w:t xml:space="preserve">5.1</w:t>
-      </w:r>
-      <w:r>
-        <w:tab/>
-      </w:r>
-      <w:r>
-        <w:rPr>
-          <w:lang w:val="es-CO"/>
-        </w:rPr>
-        <w:t xml:space="preserve">Objetivo general</w:t>
-      </w:r>
-      <w:bookmarkEnd w:id="27"/>
-    </w:p>
-    <w:p>
-      <w:pPr>
-        <w:pStyle w:val="FirstParagraph"/>
-      </w:pPr>
-      <w:r>
-        <w:rPr>
-          <w:lang w:val="es-CO"/>
-        </w:rPr>
-        <w:t xml:space="preserve">Diseñar e implementar la base de datos relacional SIGEVET para la red</w:t>
-      </w:r>
-      <w:r>
-        <w:rPr>
-          <w:lang w:val="es-CO"/>
-        </w:rPr>
-        <w:t xml:space="preserve"> </w:t>
-      </w:r>
-      <w:r>
-        <w:rPr>
-          <w:i/>
-          <w:iCs/>
-          <w:lang w:val="es-CO"/>
-        </w:rPr>
-        <w:t xml:space="preserve">Huella Sana</w:t>
-      </w:r>
-      <w:r>
-        <w:rPr>
-          <w:lang w:val="es-CO"/>
-        </w:rPr>
-        <w:t xml:space="preserve">, desde el modelo conceptual hasta</w:t>
-      </w:r>
-      <w:r>
-        <w:rPr>
-          <w:lang w:val="es-CO"/>
-        </w:rPr>
-        <w:t xml:space="preserve"> </w:t>
-      </w:r>
-      <w:r>
-        <w:rPr>
-          <w:lang w:val="es-CO"/>
-        </w:rPr>
-        <w:t xml:space="preserve">el modelo físico en MySQL sobre una máquina virtual Oracle Linux, con una aplicación web de consulta.</w:t>
-      </w:r>
-    </w:p>
-    <w:p>
-      <w:pPr>
-        <w:pStyle w:val="Heading2"/>
-      </w:pPr>
-      <w:bookmarkStart w:id="28" w:name="_cb37acc1d3c00bf5df0b06a4f27c7103121ff3b"/>
-      <w:r>
-        <w:rPr>
-          <w:rStyle w:val="SectionNumber"/>
-          <w:lang w:val="es-CO"/>
-        </w:rPr>
-        <w:t xml:space="preserve">5.2</w:t>
-      </w:r>
-      <w:r>
-        <w:tab/>
-      </w:r>
-      <w:r>
-        <w:rPr>
-          <w:lang w:val="es-CO"/>
-        </w:rPr>
-        <w:t xml:space="preserve">Objetivos específicos</w:t>
-      </w:r>
-      <w:bookmarkEnd w:id="28"/>
     </w:p>
     <w:p>
       <w:pPr>
@@ -1451,7 +1097,7 @@
         <w:rPr>
           <w:lang w:val="es-CO"/>
         </w:rPr>
-        <w:t xml:space="preserve">Levantar los requerimientos de información de la red y documentar los supuestos y reglas de negocio.</w:t>
+        <w:t xml:space="preserve">Documentar requerimientos/supuestos/reglas.</w:t>
       </w:r>
     </w:p>
     <w:p>
@@ -1466,7 +1112,7 @@
         <w:rPr>
           <w:lang w:val="es-CO"/>
         </w:rPr>
-        <w:t xml:space="preserve">Construir el modelo entidad-relación en notación Peter Chen y su versión extendida (especialización).</w:t>
+        <w:t xml:space="preserve">Modelar Peter Chen/EER.</w:t>
       </w:r>
     </w:p>
     <w:p>
@@ -1481,19 +1127,7 @@
         <w:rPr>
           <w:lang w:val="es-CO"/>
         </w:rPr>
-        <w:t xml:space="preserve">Construir el modelo lógico en notación Barker / Crow’s Foot y el modelo relacional en Crow’s Foot con MySQL</w:t>
-      </w:r>
-      <w:r>
-        <w:rPr>
-          <w:lang w:val="es-CO"/>
-        </w:rPr>
-        <w:t xml:space="preserve"> </w:t>
-      </w:r>
-      <w:r>
-        <w:rPr>
-          <w:lang w:val="es-CO"/>
-        </w:rPr>
-        <w:t xml:space="preserve">Workbench.</w:t>
+        <w:t xml:space="preserve">Modelar Barker/Crow’s Foot y relacional: MySQL Workbench.</w:t>
       </w:r>
     </w:p>
     <w:p>
@@ -1508,7 +1142,7 @@
         <w:rPr>
           <w:lang w:val="es-CO"/>
         </w:rPr>
-        <w:t xml:space="preserve">Normalizar el esquema hasta la Tercera Forma Normal y documentar el proceso.</w:t>
+        <w:t xml:space="preserve">Documentar normalización 3FN.</w:t>
       </w:r>
     </w:p>
     <w:p>
@@ -1523,7 +1157,7 @@
         <w:rPr>
           <w:lang w:val="es-CO"/>
         </w:rPr>
-        <w:t xml:space="preserve">Elaborar el diccionario de datos con tipos, dominios y restricciones de cada columna.</w:t>
+        <w:t xml:space="preserve">Diccionario: tipos/dominios/restricciones.</w:t>
       </w:r>
     </w:p>
     <w:p>
@@ -1538,7 +1172,7 @@
         <w:rPr>
           <w:lang w:val="es-CO"/>
         </w:rPr>
-        <w:t xml:space="preserve">Formular al menos 50 consultas en álgebra relacional con su equivalente en SQL.</w:t>
+        <w:t xml:space="preserve">Mínimo 50 consultas álgebra/SQL.</w:t>
       </w:r>
     </w:p>
     <w:p>
@@ -1553,7 +1187,7 @@
         <w:rPr>
           <w:lang w:val="es-CO"/>
         </w:rPr>
-        <w:t xml:space="preserve">Seleccionar e instalar el sistema operativo y el RDBMS en una máquina virtual (Fase 2).</w:t>
+        <w:t xml:space="preserve">Seleccionar/instalar SO/RDBMS en VM (Fase 2).</w:t>
       </w:r>
     </w:p>
     <w:p>
@@ -1568,7 +1202,7 @@
         <w:rPr>
           <w:lang w:val="es-CO"/>
         </w:rPr>
-        <w:t xml:space="preserve">Implementar los scripts de creación, inserción y consulta, y conectar una aplicación web de lectura (Fase 2).</w:t>
+        <w:t xml:space="preserve">Scripts creación/inserción/consulta y web de lectura (Fase 2).</w:t>
       </w:r>
     </w:p>
     <w:p>
@@ -1583,20 +1217,20 @@
         <w:rPr>
           <w:lang w:val="es-CO"/>
         </w:rPr>
-        <w:t xml:space="preserve">Gestionar el proyecto con Git y GitHub con aportes de todos los integrantes.</w:t>
+        <w:t xml:space="preserve">Git/GitHub con aportes de todos.</w:t>
       </w:r>
     </w:p>
     <w:p>
       <w:pPr>
         <w:pStyle w:val="Heading1"/>
       </w:pPr>
-      <w:bookmarkStart w:id="29" w:name="_alcance"/>
+      <w:bookmarkStart w:id="26" w:name="_alcance"/>
       <w:r>
         <w:rPr>
           <w:rStyle w:val="SectionNumber"/>
           <w:lang w:val="es-CO"/>
         </w:rPr>
-        <w:t xml:space="preserve">6</w:t>
+        <w:t xml:space="preserve">5</w:t>
       </w:r>
       <w:r>
         <w:tab/>
@@ -1607,19 +1241,19 @@
         </w:rPr>
         <w:t xml:space="preserve">Alcance</w:t>
       </w:r>
-      <w:bookmarkEnd w:id="29"/>
+      <w:bookmarkEnd w:id="26"/>
     </w:p>
     <w:p>
       <w:pPr>
         <w:pStyle w:val="Heading2"/>
       </w:pPr>
-      <w:bookmarkStart w:id="30" w:name="_714fd8c7fc3123c9de9a24db56ddb6c8b4cc20c"/>
+      <w:bookmarkStart w:id="27" w:name="_incluye"/>
       <w:r>
         <w:rPr>
           <w:rStyle w:val="SectionNumber"/>
           <w:lang w:val="es-CO"/>
         </w:rPr>
-        <w:t xml:space="preserve">6.1</w:t>
+        <w:t xml:space="preserve">5.1</w:t>
       </w:r>
       <w:r>
         <w:tab/>
@@ -1628,9 +1262,9 @@
         <w:rPr>
           <w:lang w:val="es-CO"/>
         </w:rPr>
-        <w:t xml:space="preserve">El proyecto incluye</w:t>
-      </w:r>
-      <w:bookmarkEnd w:id="30"/>
+        <w:t xml:space="preserve">Incluye</w:t>
+      </w:r>
+      <w:bookmarkEnd w:id="27"/>
     </w:p>
     <w:p>
       <w:pPr>
@@ -1644,7 +1278,7 @@
         <w:rPr>
           <w:lang w:val="es-CO"/>
         </w:rPr>
-        <w:t xml:space="preserve">Gestión de la estructura de la red: departamentos, ciudades, sedes y su director.</w:t>
+        <w:t xml:space="preserve">Red, directores, personal especializado, clientes con teléfonos, mascotas, especies y razas.</w:t>
       </w:r>
     </w:p>
     <w:p>
@@ -1659,7 +1293,7 @@
         <w:rPr>
           <w:lang w:val="es-CO"/>
         </w:rPr>
-        <w:t xml:space="preserve">Gestión del personal: empleados con especialización en veterinarios y auxiliares; especialidades certificadas.</w:t>
+        <w:t xml:space="preserve">Historia compartida, citas, consultas y prescripciones.</w:t>
       </w:r>
     </w:p>
     <w:p>
@@ -1674,7 +1308,7 @@
         <w:rPr>
           <w:lang w:val="es-CO"/>
         </w:rPr>
-        <w:t xml:space="preserve">Gestión de clientes (con varios teléfonos), mascotas, especies y razas.</w:t>
+        <w:t xml:space="preserve">Inventario por sede con mínimos; facturación detallada.</w:t>
       </w:r>
     </w:p>
     <w:p>
@@ -1689,95 +1323,20 @@
         <w:rPr>
           <w:lang w:val="es-CO"/>
         </w:rPr>
-        <w:t xml:space="preserve">Historia clínica única por mascota, compartida por todas las sedes.</w:t>
-      </w:r>
-    </w:p>
-    <w:p>
-      <w:pPr>
-        <w:pStyle w:val="Compact"/>
-        <w:numPr>
-          <w:ilvl w:val="0"/>
-          <w:numId w:val="1002"/>
-        </w:numPr>
-      </w:pPr>
-      <w:r>
-        <w:rPr>
-          <w:lang w:val="es-CO"/>
-        </w:rPr>
-        <w:t xml:space="preserve">Agenda de citas por veterinario, sede y servicio; registro de la consulta atendida.</w:t>
-      </w:r>
-    </w:p>
-    <w:p>
-      <w:pPr>
-        <w:pStyle w:val="Compact"/>
-        <w:numPr>
-          <w:ilvl w:val="0"/>
-          <w:numId w:val="1002"/>
-        </w:numPr>
-      </w:pPr>
-      <w:r>
-        <w:rPr>
-          <w:lang w:val="es-CO"/>
-        </w:rPr>
-        <w:t xml:space="preserve">Fórmula médica (prescripción de medicamentos por consulta).</w:t>
-      </w:r>
-    </w:p>
-    <w:p>
-      <w:pPr>
-        <w:pStyle w:val="Compact"/>
-        <w:numPr>
-          <w:ilvl w:val="0"/>
-          <w:numId w:val="1002"/>
-        </w:numPr>
-      </w:pPr>
-      <w:r>
-        <w:rPr>
-          <w:lang w:val="es-CO"/>
-        </w:rPr>
-        <w:t xml:space="preserve">Inventario de medicamentos por sede con stock mínimo.</w:t>
-      </w:r>
-    </w:p>
-    <w:p>
-      <w:pPr>
-        <w:pStyle w:val="Compact"/>
-        <w:numPr>
-          <w:ilvl w:val="0"/>
-          <w:numId w:val="1002"/>
-        </w:numPr>
-      </w:pPr>
-      <w:r>
-        <w:rPr>
-          <w:lang w:val="es-CO"/>
-        </w:rPr>
-        <w:t xml:space="preserve">Facturación de servicios y medicamentos con detalle por línea.</w:t>
-      </w:r>
-    </w:p>
-    <w:p>
-      <w:pPr>
-        <w:pStyle w:val="Compact"/>
-        <w:numPr>
-          <w:ilvl w:val="0"/>
-          <w:numId w:val="1002"/>
-        </w:numPr>
-      </w:pPr>
-      <w:r>
-        <w:rPr>
-          <w:lang w:val="es-CO"/>
-        </w:rPr>
-        <w:t xml:space="preserve">Consultas de lectura desde una aplicación web de demostración.</w:t>
+        <w:t xml:space="preserve">Demostración web de lectura.</w:t>
       </w:r>
     </w:p>
     <w:p>
       <w:pPr>
         <w:pStyle w:val="Heading2"/>
       </w:pPr>
-      <w:bookmarkStart w:id="31" w:name="_04f9318db6af9908d6d4c0292caaac3914bb202"/>
+      <w:bookmarkStart w:id="28" w:name="_excluye"/>
       <w:r>
         <w:rPr>
           <w:rStyle w:val="SectionNumber"/>
           <w:lang w:val="es-CO"/>
         </w:rPr>
-        <w:t xml:space="preserve">6.2</w:t>
+        <w:t xml:space="preserve">5.2</w:t>
       </w:r>
       <w:r>
         <w:tab/>
@@ -1786,9 +1345,9 @@
         <w:rPr>
           <w:lang w:val="es-CO"/>
         </w:rPr>
-        <w:t xml:space="preserve">El proyecto no incluye</w:t>
-      </w:r>
-      <w:bookmarkEnd w:id="31"/>
+        <w:t xml:space="preserve">Excluye</w:t>
+      </w:r>
+      <w:bookmarkEnd w:id="28"/>
     </w:p>
     <w:p>
       <w:pPr>
@@ -1802,7 +1361,7 @@
         <w:rPr>
           <w:lang w:val="es-CO"/>
         </w:rPr>
-        <w:t xml:space="preserve">Facturación electrónica ante la DIAN, nómina, contabilidad ni pasarela de pagos.</w:t>
+        <w:t xml:space="preserve">DIAN, nómina, contabilidad, pasarela de pagos, compras, lotes y vencimientos.</w:t>
       </w:r>
     </w:p>
     <w:p>
@@ -1817,50 +1376,20 @@
         <w:rPr>
           <w:lang w:val="es-CO"/>
         </w:rPr>
-        <w:t xml:space="preserve">Compras a proveedores, lotes y fechas de vencimiento de medicamentos.</w:t>
-      </w:r>
-    </w:p>
-    <w:p>
-      <w:pPr>
-        <w:pStyle w:val="Compact"/>
-        <w:numPr>
-          <w:ilvl w:val="0"/>
-          <w:numId w:val="1003"/>
-        </w:numPr>
-      </w:pPr>
-      <w:r>
-        <w:rPr>
-          <w:lang w:val="es-CO"/>
-        </w:rPr>
-        <w:t xml:space="preserve">Autenticación de usuarios finales en la aplicación web (la app es de solo lectura y de demostración).</w:t>
-      </w:r>
-    </w:p>
-    <w:p>
-      <w:pPr>
-        <w:pStyle w:val="Compact"/>
-        <w:numPr>
-          <w:ilvl w:val="0"/>
-          <w:numId w:val="1003"/>
-        </w:numPr>
-      </w:pPr>
-      <w:r>
-        <w:rPr>
-          <w:lang w:val="es-CO"/>
-        </w:rPr>
-        <w:t xml:space="preserve">Aplicación móvil, alta disponibilidad o réplicas de la base de datos.</w:t>
+        <w:t xml:space="preserve">Autenticación final, aplicación móvil, alta disponibilidad o réplicas.</w:t>
       </w:r>
     </w:p>
     <w:p>
       <w:pPr>
         <w:pStyle w:val="Heading1"/>
       </w:pPr>
-      <w:bookmarkStart w:id="32" w:name="_142115a96dc94394fb1234a2de664064dcd8a7b"/>
+      <w:bookmarkStart w:id="29" w:name="_actores"/>
       <w:r>
         <w:rPr>
           <w:rStyle w:val="SectionNumber"/>
           <w:lang w:val="es-CO"/>
         </w:rPr>
-        <w:t xml:space="preserve">7</w:t>
+        <w:t xml:space="preserve">6</w:t>
       </w:r>
       <w:r>
         <w:tab/>
@@ -1869,9 +1398,9 @@
         <w:rPr>
           <w:lang w:val="es-CO"/>
         </w:rPr>
-        <w:t xml:space="preserve">Actores del sistema</w:t>
-      </w:r>
-      <w:bookmarkEnd w:id="32"/>
+        <w:t xml:space="preserve">Actores</w:t>
+      </w:r>
+      <w:bookmarkEnd w:id="29"/>
     </w:p>
     <w:p>
       <w:pPr>
@@ -1881,7 +1410,7 @@
         <w:rPr>
           <w:lang w:val="es-CO"/>
         </w:rPr>
-        <w:t xml:space="preserve">Actores del sistema</w:t>
+        <w:t xml:space="preserve">Actores</w:t>
       </w:r>
     </w:p>
     <w:tbl>
@@ -1890,7 +1419,7 @@
         <w:tblW w:type="pct" w:w="5000"/>
         <w:tblLayout w:type="fixed"/>
         <w:tblLook w:firstRow="1" w:lastRow="0" w:firstColumn="0" w:lastColumn="0" w:noHBand="0" w:noVBand="0" w:val="0020"/>
-        <w:tblCaption w:val="Actores del sistema"/>
+        <w:tblCaption w:val="Actores"/>
         <w:tblBorders>
           <w:top w:val="single" w:sz="4" w:color="A6A6A6"/>
           <w:left w:val="single" w:sz="4" w:color="A6A6A6"/>
@@ -1972,7 +1501,7 @@
                 <w:sz w:val="19"/>
                 <w:lang w:val="es-CO"/>
               </w:rPr>
-              <w:t xml:space="preserve">Consulta indicadores de ingresos, citas y ocupación por sede</w:t>
+              <w:t xml:space="preserve">Consulta ingresos, citas, ocupación por sede</w:t>
             </w:r>
           </w:p>
         </w:tc>
@@ -2004,7 +1533,7 @@
                 <w:sz w:val="19"/>
                 <w:lang w:val="es-CO"/>
               </w:rPr>
-              <w:t xml:space="preserve">Supervisa agenda, personal e inventario de su sede</w:t>
+              <w:t xml:space="preserve">Supervisa agenda/personal/inventario</w:t>
             </w:r>
           </w:p>
         </w:tc>
@@ -2036,7 +1565,7 @@
                 <w:sz w:val="19"/>
                 <w:lang w:val="es-CO"/>
               </w:rPr>
-              <w:t xml:space="preserve">Registra clientes, mascotas, citas y facturas</w:t>
+              <w:t xml:space="preserve">Registra clientes/mascotas/citas/facturas</w:t>
             </w:r>
           </w:p>
         </w:tc>
@@ -2068,7 +1597,7 @@
                 <w:sz w:val="19"/>
                 <w:lang w:val="es-CO"/>
               </w:rPr>
-              <w:t xml:space="preserve">Atiende citas, registra consultas y formula medicamentos</w:t>
+              <w:t xml:space="preserve">Atiende, registra consultas, formula</w:t>
             </w:r>
           </w:p>
         </w:tc>
@@ -2100,7 +1629,7 @@
                 <w:sz w:val="19"/>
                 <w:lang w:val="es-CO"/>
               </w:rPr>
-              <w:t xml:space="preserve">Asiste consultas y registra signos vitales</w:t>
+              <w:t xml:space="preserve">Asiste, registra signos vitales</w:t>
             </w:r>
           </w:p>
         </w:tc>
@@ -2132,7 +1661,7 @@
                 <w:sz w:val="19"/>
                 <w:lang w:val="es-CO"/>
               </w:rPr>
-              <w:t xml:space="preserve">Fuente de datos; recibe atención y facturas</w:t>
+              <w:t xml:space="preserve">Aporta datos; recibe atención/facturas</w:t>
             </w:r>
           </w:p>
         </w:tc>
@@ -2142,13 +1671,13 @@
       <w:pPr>
         <w:pStyle w:val="Heading1"/>
       </w:pPr>
-      <w:bookmarkStart w:id="33" w:name="_6e1d0054467e5654c4843d75225894c479fa1e1"/>
+      <w:bookmarkStart w:id="30" w:name="_funcionales"/>
       <w:r>
         <w:rPr>
           <w:rStyle w:val="SectionNumber"/>
           <w:lang w:val="es-CO"/>
         </w:rPr>
-        <w:t xml:space="preserve">8</w:t>
+        <w:t xml:space="preserve">7</w:t>
       </w:r>
       <w:r>
         <w:tab/>
@@ -2157,9 +1686,9 @@
         <w:rPr>
           <w:lang w:val="es-CO"/>
         </w:rPr>
-        <w:t xml:space="preserve">Requerimientos funcionales</w:t>
-      </w:r>
-      <w:bookmarkEnd w:id="33"/>
+        <w:t xml:space="preserve">Funcionales</w:t>
+      </w:r>
+      <w:bookmarkEnd w:id="30"/>
     </w:p>
     <w:p>
       <w:pPr>
@@ -2169,7 +1698,7 @@
         <w:rPr>
           <w:lang w:val="es-CO"/>
         </w:rPr>
-        <w:t xml:space="preserve">Requerimientos funcionales</w:t>
+        <w:t xml:space="preserve">Funcionales</w:t>
       </w:r>
     </w:p>
     <w:tbl>
@@ -2178,7 +1707,7 @@
         <w:tblW w:type="pct" w:w="5000"/>
         <w:tblLayout w:type="fixed"/>
         <w:tblLook w:firstRow="1" w:lastRow="0" w:firstColumn="0" w:lastColumn="0" w:noHBand="0" w:noVBand="0" w:val="0020"/>
-        <w:tblCaption w:val="Requerimientos funcionales"/>
+        <w:tblCaption w:val="Funcionales"/>
         <w:tblBorders>
           <w:top w:val="single" w:sz="4" w:color="A6A6A6"/>
           <w:left w:val="single" w:sz="4" w:color="A6A6A6"/>
@@ -2279,7 +1808,7 @@
                 <w:sz w:val="19"/>
                 <w:lang w:val="es-CO"/>
               </w:rPr>
-              <w:t xml:space="preserve">Registrar departamentos y ciudades con su código DANE</w:t>
+              <w:t xml:space="preserve">Departamentos/ciudades con DANE</w:t>
             </w:r>
           </w:p>
         </w:tc>
@@ -2326,7 +1855,7 @@
                 <w:sz w:val="19"/>
                 <w:lang w:val="es-CO"/>
               </w:rPr>
-              <w:t xml:space="preserve">Registrar sedes con su ciudad y su director (un director por sede)</w:t>
+              <w:t xml:space="preserve">Sede: ciudad y director único</w:t>
             </w:r>
           </w:p>
         </w:tc>
@@ -2373,7 +1902,7 @@
                 <w:sz w:val="19"/>
                 <w:lang w:val="es-CO"/>
               </w:rPr>
-              <w:t xml:space="preserve">Registrar empleados indicando su sede y su tipo (veterinario, auxiliar o administrativo)</w:t>
+              <w:t xml:space="preserve">Empleado: sede; veterinario/auxiliar/administrativo</w:t>
             </w:r>
           </w:p>
         </w:tc>
@@ -2420,7 +1949,7 @@
                 <w:sz w:val="19"/>
                 <w:lang w:val="es-CO"/>
               </w:rPr>
-              <w:t xml:space="preserve">Registrar los datos profesionales de veterinarios y las especialidades certificadas con su fecha</w:t>
+              <w:t xml:space="preserve">Veterinario: datos profesionales, especialidades certificadas fechadas</w:t>
             </w:r>
           </w:p>
         </w:tc>
@@ -2467,7 +1996,7 @@
                 <w:sz w:val="19"/>
                 <w:lang w:val="es-CO"/>
               </w:rPr>
-              <w:t xml:space="preserve">Registrar los datos de auxiliares (área, certificación y turno)</w:t>
+              <w:t xml:space="preserve">Auxiliar: área, certificación, turno</w:t>
             </w:r>
           </w:p>
         </w:tc>
@@ -2514,7 +2043,7 @@
                 <w:sz w:val="19"/>
                 <w:lang w:val="es-CO"/>
               </w:rPr>
-              <w:t xml:space="preserve">Registrar clientes con documento único y uno o varios teléfonos</w:t>
+              <w:t xml:space="preserve">Cliente: documento único, mínimo un teléfono</w:t>
             </w:r>
           </w:p>
         </w:tc>
@@ -2561,7 +2090,7 @@
                 <w:sz w:val="19"/>
                 <w:lang w:val="es-CO"/>
               </w:rPr>
-              <w:t xml:space="preserve">Registrar mascotas con raza, especie (derivada de la raza), propietario y microchip opcional</w:t>
+              <w:t xml:space="preserve">Mascota: raza, especie derivada, propietario, microchip opcional</w:t>
             </w:r>
           </w:p>
         </w:tc>
@@ -2608,7 +2137,7 @@
                 <w:sz w:val="19"/>
                 <w:lang w:val="es-CO"/>
               </w:rPr>
-              <w:t xml:space="preserve">Abrir automáticamente una única historia clínica por mascota</w:t>
+              <w:t xml:space="preserve">Historia única automática por mascota</w:t>
             </w:r>
           </w:p>
         </w:tc>
@@ -2655,7 +2184,7 @@
                 <w:sz w:val="19"/>
                 <w:lang w:val="es-CO"/>
               </w:rPr>
-              <w:t xml:space="preserve">Mantener el catálogo de servicios con precio y duración</w:t>
+              <w:t xml:space="preserve">Servicios: precio, duración</w:t>
             </w:r>
           </w:p>
         </w:tc>
@@ -2702,7 +2231,7 @@
                 <w:sz w:val="19"/>
                 <w:lang w:val="es-CO"/>
               </w:rPr>
-              <w:t xml:space="preserve">Agendar citas validando que un veterinario no tenga dos citas a la misma hora</w:t>
+              <w:t xml:space="preserve">Citas sin cruce por veterinario</w:t>
             </w:r>
           </w:p>
         </w:tc>
@@ -2749,7 +2278,7 @@
                 <w:sz w:val="19"/>
                 <w:lang w:val="es-CO"/>
               </w:rPr>
-              <w:t xml:space="preserve">Cambiar el estado de la cita (programada, atendida, cancelada, no asistió)</w:t>
+              <w:t xml:space="preserve">Cita: programada/atendida/cancelada/no asistió</w:t>
             </w:r>
           </w:p>
         </w:tc>
@@ -2796,7 +2325,7 @@
                 <w:sz w:val="19"/>
                 <w:lang w:val="es-CO"/>
               </w:rPr>
-              <w:t xml:space="preserve">Registrar la consulta de una cita atendida con peso, temperatura, diagnóstico y auxiliar</w:t>
+              <w:t xml:space="preserve">Consulta de cita atendida: peso/temperatura/diagnóstico/auxiliar</w:t>
             </w:r>
           </w:p>
         </w:tc>
@@ -2843,7 +2372,7 @@
                 <w:sz w:val="19"/>
                 <w:lang w:val="es-CO"/>
               </w:rPr>
-              <w:t xml:space="preserve">Registrar la fórmula médica: medicamentos, dosis, frecuencia, duración y cantidad</w:t>
+              <w:t xml:space="preserve">Fórmula: medicamento/dosis/frecuencia/duración/cantidad</w:t>
             </w:r>
           </w:p>
         </w:tc>
@@ -2890,7 +2419,7 @@
                 <w:sz w:val="19"/>
                 <w:lang w:val="es-CO"/>
               </w:rPr>
-              <w:t xml:space="preserve">Controlar el inventario de cada medicamento por sede con stock mínimo</w:t>
+              <w:t xml:space="preserve">Inventario sede/medicamento con mínimo</w:t>
             </w:r>
           </w:p>
         </w:tc>
@@ -2937,7 +2466,7 @@
                 <w:sz w:val="19"/>
                 <w:lang w:val="es-CO"/>
               </w:rPr>
-              <w:t xml:space="preserve">Emitir facturas con número consecutivo único, cliente, sede, empleado y medio de pago</w:t>
+              <w:t xml:space="preserve">Factura: consecutivo único, cliente/sede/empleado/pago</w:t>
             </w:r>
           </w:p>
         </w:tc>
@@ -2984,7 +2513,7 @@
                 <w:sz w:val="19"/>
                 <w:lang w:val="es-CO"/>
               </w:rPr>
-              <w:t xml:space="preserve">Registrar líneas de factura que cobren un servicio o un medicamento (nunca ambos)</w:t>
+              <w:t xml:space="preserve">Línea: servicio o medicamento, excluyentes</w:t>
             </w:r>
           </w:p>
         </w:tc>
@@ -3031,7 +2560,7 @@
                 <w:sz w:val="19"/>
                 <w:lang w:val="es-CO"/>
               </w:rPr>
-              <w:t xml:space="preserve">Consultar la historia clínica completa de una mascota en cualquier sede</w:t>
+              <w:t xml:space="preserve">Consultar historia completa entre sedes</w:t>
             </w:r>
           </w:p>
         </w:tc>
@@ -3078,7 +2607,7 @@
                 <w:sz w:val="19"/>
                 <w:lang w:val="es-CO"/>
               </w:rPr>
-              <w:t xml:space="preserve">Consultar la agenda de un veterinario o de una sede por fecha</w:t>
+              <w:t xml:space="preserve">Consultar agenda veterinario/sede por fecha</w:t>
             </w:r>
           </w:p>
         </w:tc>
@@ -3125,7 +2654,7 @@
                 <w:sz w:val="19"/>
                 <w:lang w:val="es-CO"/>
               </w:rPr>
-              <w:t xml:space="preserve">Consultar medicamentos con existencias por debajo del mínimo por sede</w:t>
+              <w:t xml:space="preserve">Consultar medicamentos bajo mínimo por sede</w:t>
             </w:r>
           </w:p>
         </w:tc>
@@ -3172,7 +2701,7 @@
                 <w:sz w:val="19"/>
                 <w:lang w:val="es-CO"/>
               </w:rPr>
-              <w:t xml:space="preserve">Consultar ingresos por sede, por servicio y por periodo</w:t>
+              <w:t xml:space="preserve">Consultar ingresos por sede/servicio/periodo</w:t>
             </w:r>
           </w:p>
         </w:tc>
@@ -3197,13 +2726,13 @@
       <w:pPr>
         <w:pStyle w:val="Heading1"/>
       </w:pPr>
-      <w:bookmarkStart w:id="34" w:name="_ee88185d4ed4f1c5b8402be201f06cea41bb2da"/>
+      <w:bookmarkStart w:id="31" w:name="_6522b08f0d50c2bd189319312f022fab85b860e"/>
       <w:r>
         <w:rPr>
           <w:rStyle w:val="SectionNumber"/>
           <w:lang w:val="es-CO"/>
         </w:rPr>
-        <w:t xml:space="preserve">9</w:t>
+        <w:t xml:space="preserve">8</w:t>
       </w:r>
       <w:r>
         <w:tab/>
@@ -3212,9 +2741,9 @@
         <w:rPr>
           <w:lang w:val="es-CO"/>
         </w:rPr>
-        <w:t xml:space="preserve">Requerimientos no funcionales</w:t>
-      </w:r>
-      <w:bookmarkEnd w:id="34"/>
+        <w:t xml:space="preserve">No funcionales</w:t>
+      </w:r>
+      <w:bookmarkEnd w:id="31"/>
     </w:p>
     <w:p>
       <w:pPr>
@@ -3224,16 +2753,15 @@
         <w:rPr>
           <w:lang w:val="es-CO"/>
         </w:rPr>
-        <w:t xml:space="preserve">Requerimientos no funcionales</w:t>
+        <w:t xml:space="preserve">No funcionales</w:t>
       </w:r>
     </w:p>
     <w:tbl>
       <w:tblPr>
         <w:tblStyle w:val="Table"/>
-        <w:tblW w:type="pct" w:w="5000"/>
-        <w:tblLayout w:type="fixed"/>
+        <w:tblW w:type="auto" w:w="0"/>
         <w:tblLook w:firstRow="1" w:lastRow="0" w:firstColumn="0" w:lastColumn="0" w:noHBand="0" w:noVBand="0" w:val="0020"/>
-        <w:tblCaption w:val="Requerimientos no funcionales"/>
+        <w:tblCaption w:val="No funcionales"/>
         <w:tblBorders>
           <w:top w:val="single" w:sz="4" w:color="A6A6A6"/>
           <w:left w:val="single" w:sz="4" w:color="A6A6A6"/>
@@ -3315,7 +2843,7 @@
                 <w:sz w:val="19"/>
                 <w:lang w:val="es-CO"/>
               </w:rPr>
-              <w:t xml:space="preserve">El esquema debe estar normalizado hasta Tercera Forma Normal (3FN).</w:t>
+              <w:t xml:space="preserve">Tercera Forma Normal (3FN).</w:t>
             </w:r>
           </w:p>
         </w:tc>
@@ -3347,7 +2875,7 @@
                 <w:sz w:val="19"/>
                 <w:lang w:val="es-CO"/>
               </w:rPr>
-              <w:t xml:space="preserve">Toda regla de integridad expresable de forma declarativa se implementa con PK, FK, UNIQUE, CHECK y NOT NULL.</w:t>
+              <w:t xml:space="preserve">Integridad declarativa: PK/FK/UNIQUE/CHECK/NOT NULL.</w:t>
             </w:r>
           </w:p>
         </w:tc>
@@ -3379,7 +2907,7 @@
                 <w:sz w:val="19"/>
                 <w:lang w:val="es-CO"/>
               </w:rPr>
-              <w:t xml:space="preserve">El RDBMS debe ser distinto de SQL Server y ejecutarse en una máquina virtual Linux/Unix.</w:t>
+              <w:t xml:space="preserve">RDBMS distinto de SQL Server, VM Linux/Unix.</w:t>
             </w:r>
           </w:p>
         </w:tc>
@@ -3411,7 +2939,7 @@
                 <w:sz w:val="19"/>
                 <w:lang w:val="es-CO"/>
               </w:rPr>
-              <w:t xml:space="preserve">La aplicación web se conecta con un usuario de solo lectura (principio de mínimo privilegio).</w:t>
+              <w:t xml:space="preserve">Usuario web de solo lectura.</w:t>
             </w:r>
           </w:p>
         </w:tc>
@@ -3443,7 +2971,14 @@
                 <w:sz w:val="19"/>
                 <w:lang w:val="es-CO"/>
               </w:rPr>
-              <w:t xml:space="preserve">Las restricciones siguen una convención de nombres (</w:t>
+              <w:t xml:space="preserve">Nombres:</w:t>
+            </w:r>
+            <w:r>
+              <w:rPr>
+                <w:sz w:val="19"/>
+                <w:lang w:val="es-CO"/>
+              </w:rPr>
+              <w:t xml:space="preserve"> </w:t>
             </w:r>
             <w:r>
               <w:rPr>
@@ -3524,7 +3059,7 @@
                 <w:sz w:val="19"/>
                 <w:lang w:val="es-CO"/>
               </w:rPr>
-              <w:t xml:space="preserve">) para facilitar el mantenimiento.</w:t>
+              <w:t xml:space="preserve">.</w:t>
             </w:r>
           </w:p>
         </w:tc>
@@ -3556,7 +3091,7 @@
                 <w:sz w:val="19"/>
                 <w:lang w:val="es-CO"/>
               </w:rPr>
-              <w:t xml:space="preserve">Todo el código y la documentación se versionan en un repositorio GitHub con aportes de los tres integrantes.</w:t>
+              <w:t xml:space="preserve">Código/documentación en GitHub; aportes de los tres.</w:t>
             </w:r>
           </w:p>
         </w:tc>
@@ -3566,13 +3101,13 @@
       <w:pPr>
         <w:pStyle w:val="Heading1"/>
       </w:pPr>
-      <w:bookmarkStart w:id="35" w:name="_ab39adef1dad34790688a9eede727399d523432"/>
+      <w:bookmarkStart w:id="32" w:name="_modelo"/>
       <w:r>
         <w:rPr>
           <w:rStyle w:val="SectionNumber"/>
           <w:lang w:val="es-CO"/>
         </w:rPr>
-        <w:t xml:space="preserve">10</w:t>
+        <w:t xml:space="preserve">9</w:t>
       </w:r>
       <w:r>
         <w:tab/>
@@ -3581,26 +3116,14 @@
         <w:rPr>
           <w:lang w:val="es-CO"/>
         </w:rPr>
-        <w:t xml:space="preserve">Visión preliminar del modelo de datos</w:t>
-      </w:r>
-      <w:bookmarkEnd w:id="35"/>
+        <w:t xml:space="preserve">Modelo</w:t>
+      </w:r>
+      <w:bookmarkEnd w:id="32"/>
     </w:p>
     <w:p>
       <w:pPr>
         <w:pStyle w:val="FirstParagraph"/>
       </w:pPr>
-      <w:r>
-        <w:rPr>
-          <w:lang w:val="es-CO"/>
-        </w:rPr>
-        <w:t xml:space="preserve">El análisis identificó</w:t>
-      </w:r>
-      <w:r>
-        <w:rPr>
-          <w:lang w:val="es-CO"/>
-        </w:rPr>
-        <w:t xml:space="preserve"> </w:t>
-      </w:r>
       <w:r>
         <w:rPr>
           <w:b/>
@@ -3613,13 +3136,7 @@
         <w:rPr>
           <w:lang w:val="es-CO"/>
         </w:rPr>
-        <w:t xml:space="preserve"> </w:t>
-      </w:r>
-      <w:r>
-        <w:rPr>
-          <w:lang w:val="es-CO"/>
-        </w:rPr>
-        <w:t xml:space="preserve">y</w:t>
+        <w:t xml:space="preserve">,</w:t>
       </w:r>
       <w:r>
         <w:rPr>
@@ -3639,7 +3156,7 @@
         <w:rPr>
           <w:lang w:val="es-CO"/>
         </w:rPr>
-        <w:t xml:space="preserve">, que cumplen y superan los mínimos del enunciado:</w:t>
+        <w:t xml:space="preserve">.</w:t>
       </w:r>
     </w:p>
     <w:p>
@@ -3650,7 +3167,7 @@
         <w:rPr>
           <w:lang w:val="es-CO"/>
         </w:rPr>
-        <w:t xml:space="preserve">Cumplimiento de los criterios del enunciado</w:t>
+        <w:t xml:space="preserve">Criterios</w:t>
       </w:r>
     </w:p>
     <w:tbl>
@@ -3659,7 +3176,7 @@
         <w:tblW w:type="pct" w:w="5000"/>
         <w:tblLayout w:type="fixed"/>
         <w:tblLook w:firstRow="1" w:lastRow="0" w:firstColumn="0" w:lastColumn="0" w:noHBand="0" w:noVBand="0" w:val="0020"/>
-        <w:tblCaption w:val="Cumplimiento de los criterios del enunciado"/>
+        <w:tblCaption w:val="Criterios"/>
         <w:tblBorders>
           <w:top w:val="single" w:sz="4" w:color="A6A6A6"/>
           <w:left w:val="single" w:sz="4" w:color="A6A6A6"/>
@@ -3726,214 +3243,214 @@
                 <w:sz w:val="19"/>
                 <w:lang w:val="es-CO"/>
               </w:rPr>
-              <w:t xml:space="preserve">Al menos 8 entidades</w:t>
-            </w:r>
-          </w:p>
-        </w:tc>
-        <w:tc>
-          <w:tcPr/>
-          <w:p>
-            <w:pPr>
-              <w:pStyle w:val="Compact"/>
-            </w:pPr>
-            <w:r>
-              <w:rPr>
-                <w:sz w:val="19"/>
-                <w:lang w:val="es-CO"/>
-              </w:rPr>
-              <w:t xml:space="preserve">18 entidades (17 fuertes y 1 débil), implementadas en 22 tablas</w:t>
-            </w:r>
-          </w:p>
-        </w:tc>
-      </w:tr>
-      <w:tr>
-        <w:tc>
-          <w:tcPr/>
-          <w:p>
-            <w:pPr>
-              <w:pStyle w:val="Compact"/>
-            </w:pPr>
-            <w:r>
-              <w:rPr>
-                <w:sz w:val="19"/>
-                <w:lang w:val="es-CO"/>
-              </w:rPr>
-              <w:t xml:space="preserve">Relaciones uno a uno</w:t>
-            </w:r>
-          </w:p>
-        </w:tc>
-        <w:tc>
-          <w:tcPr/>
-          <w:p>
-            <w:pPr>
-              <w:pStyle w:val="Compact"/>
-            </w:pPr>
-            <w:r>
-              <w:rPr>
-                <w:sz w:val="19"/>
-                <w:lang w:val="es-CO"/>
-              </w:rPr>
-              <w:t xml:space="preserve">5: DIRIGIR (empleado–sede), TENER (mascota–historia clínica), GENERAR (cita–consulta) y las 2 de la especialización</w:t>
-            </w:r>
-          </w:p>
-        </w:tc>
-      </w:tr>
-      <w:tr>
-        <w:tc>
-          <w:tcPr/>
-          <w:p>
-            <w:pPr>
-              <w:pStyle w:val="Compact"/>
-            </w:pPr>
-            <w:r>
-              <w:rPr>
-                <w:sz w:val="19"/>
-                <w:lang w:val="es-CO"/>
-              </w:rPr>
-              <w:t xml:space="preserve">Relaciones uno a muchos</w:t>
-            </w:r>
-          </w:p>
-        </w:tc>
-        <w:tc>
-          <w:tcPr/>
-          <w:p>
-            <w:pPr>
-              <w:pStyle w:val="Compact"/>
-            </w:pPr>
-            <w:r>
-              <w:rPr>
-                <w:sz w:val="19"/>
-                <w:lang w:val="es-CO"/>
-              </w:rPr>
-              <w:t xml:space="preserve">18, por ejemplo POSEER (cliente–mascota) y CONTENER (factura–detalle)</w:t>
-            </w:r>
-          </w:p>
-        </w:tc>
-      </w:tr>
-      <w:tr>
-        <w:tc>
-          <w:tcPr/>
-          <w:p>
-            <w:pPr>
-              <w:pStyle w:val="Compact"/>
-            </w:pPr>
-            <w:r>
-              <w:rPr>
-                <w:sz w:val="19"/>
-                <w:lang w:val="es-CO"/>
-              </w:rPr>
-              <w:t xml:space="preserve">Relaciones muchos a muchos</w:t>
-            </w:r>
-          </w:p>
-        </w:tc>
-        <w:tc>
-          <w:tcPr/>
-          <w:p>
-            <w:pPr>
-              <w:pStyle w:val="Compact"/>
-            </w:pPr>
-            <w:r>
-              <w:rPr>
-                <w:sz w:val="19"/>
-                <w:lang w:val="es-CO"/>
-              </w:rPr>
-              <w:t xml:space="preserve">3: CERTIFICAR (veterinario–especialidad), PRESCRIBIR (consulta–medicamento) y ALMACENAR (sede–medicamento)</w:t>
-            </w:r>
-          </w:p>
-        </w:tc>
-      </w:tr>
-      <w:tr>
-        <w:tc>
-          <w:tcPr/>
-          <w:p>
-            <w:pPr>
-              <w:pStyle w:val="Compact"/>
-            </w:pPr>
-            <w:r>
-              <w:rPr>
-                <w:sz w:val="19"/>
-                <w:lang w:val="es-CO"/>
-              </w:rPr>
-              <w:t xml:space="preserve">Modelo extendido</w:t>
-            </w:r>
-          </w:p>
-        </w:tc>
-        <w:tc>
-          <w:tcPr/>
-          <w:p>
-            <w:pPr>
-              <w:pStyle w:val="Compact"/>
-            </w:pPr>
-            <w:r>
-              <w:rPr>
-                <w:sz w:val="19"/>
-                <w:lang w:val="es-CO"/>
-              </w:rPr>
-              <w:t xml:space="preserve">Especialización disyunta y parcial de EMPLEADO en VETERINARIO y AUXILIAR</w:t>
-            </w:r>
-          </w:p>
-        </w:tc>
-      </w:tr>
-      <w:tr>
-        <w:tc>
-          <w:tcPr/>
-          <w:p>
-            <w:pPr>
-              <w:pStyle w:val="Compact"/>
-            </w:pPr>
-            <w:r>
-              <w:rPr>
-                <w:sz w:val="19"/>
-                <w:lang w:val="es-CO"/>
-              </w:rPr>
-              <w:t xml:space="preserve">Normalización a 3FN</w:t>
-            </w:r>
-          </w:p>
-        </w:tc>
-        <w:tc>
-          <w:tcPr/>
-          <w:p>
-            <w:pPr>
-              <w:pStyle w:val="Compact"/>
-            </w:pPr>
-            <w:r>
-              <w:rPr>
-                <w:sz w:val="19"/>
-                <w:lang w:val="es-CO"/>
-              </w:rPr>
-              <w:t xml:space="preserve">Atributo multivaluado (teléfonos) → 1FN; detalle de factura → 2FN; raza → especie y ciudad → departamento → 3FN</w:t>
-            </w:r>
-          </w:p>
-        </w:tc>
-      </w:tr>
-      <w:tr>
-        <w:tc>
-          <w:tcPr/>
-          <w:p>
-            <w:pPr>
-              <w:pStyle w:val="Compact"/>
-            </w:pPr>
-            <w:r>
-              <w:rPr>
-                <w:sz w:val="19"/>
-                <w:lang w:val="es-CO"/>
-              </w:rPr>
-              <w:t xml:space="preserve">Consultas complejas</w:t>
-            </w:r>
-          </w:p>
-        </w:tc>
-        <w:tc>
-          <w:tcPr/>
-          <w:p>
-            <w:pPr>
-              <w:pStyle w:val="Compact"/>
-            </w:pPr>
-            <w:r>
-              <w:rPr>
-                <w:sz w:val="19"/>
-                <w:lang w:val="es-CO"/>
-              </w:rPr>
-              <w:t xml:space="preserve">55 ejercicios de álgebra relacional con su SQL y resultado verificado</w:t>
+              <w:t xml:space="preserve">Mínimo 8 entidades</w:t>
+            </w:r>
+          </w:p>
+        </w:tc>
+        <w:tc>
+          <w:tcPr/>
+          <w:p>
+            <w:pPr>
+              <w:pStyle w:val="Compact"/>
+            </w:pPr>
+            <w:r>
+              <w:rPr>
+                <w:sz w:val="19"/>
+                <w:lang w:val="es-CO"/>
+              </w:rPr>
+              <w:t xml:space="preserve">18: 17 fuertes, 1 débil; 22 tablas</w:t>
+            </w:r>
+          </w:p>
+        </w:tc>
+      </w:tr>
+      <w:tr>
+        <w:tc>
+          <w:tcPr/>
+          <w:p>
+            <w:pPr>
+              <w:pStyle w:val="Compact"/>
+            </w:pPr>
+            <w:r>
+              <w:rPr>
+                <w:sz w:val="19"/>
+                <w:lang w:val="es-CO"/>
+              </w:rPr>
+              <w:t xml:space="preserve">Uno a uno</w:t>
+            </w:r>
+          </w:p>
+        </w:tc>
+        <w:tc>
+          <w:tcPr/>
+          <w:p>
+            <w:pPr>
+              <w:pStyle w:val="Compact"/>
+            </w:pPr>
+            <w:r>
+              <w:rPr>
+                <w:sz w:val="19"/>
+                <w:lang w:val="es-CO"/>
+              </w:rPr>
+              <w:t xml:space="preserve">5: DIRIGIR, TENER, GENERAR, 2 de especialización</w:t>
+            </w:r>
+          </w:p>
+        </w:tc>
+      </w:tr>
+      <w:tr>
+        <w:tc>
+          <w:tcPr/>
+          <w:p>
+            <w:pPr>
+              <w:pStyle w:val="Compact"/>
+            </w:pPr>
+            <w:r>
+              <w:rPr>
+                <w:sz w:val="19"/>
+                <w:lang w:val="es-CO"/>
+              </w:rPr>
+              <w:t xml:space="preserve">Uno a muchos</w:t>
+            </w:r>
+          </w:p>
+        </w:tc>
+        <w:tc>
+          <w:tcPr/>
+          <w:p>
+            <w:pPr>
+              <w:pStyle w:val="Compact"/>
+            </w:pPr>
+            <w:r>
+              <w:rPr>
+                <w:sz w:val="19"/>
+                <w:lang w:val="es-CO"/>
+              </w:rPr>
+              <w:t xml:space="preserve">18: incluyen POSEER, CONTENER</w:t>
+            </w:r>
+          </w:p>
+        </w:tc>
+      </w:tr>
+      <w:tr>
+        <w:tc>
+          <w:tcPr/>
+          <w:p>
+            <w:pPr>
+              <w:pStyle w:val="Compact"/>
+            </w:pPr>
+            <w:r>
+              <w:rPr>
+                <w:sz w:val="19"/>
+                <w:lang w:val="es-CO"/>
+              </w:rPr>
+              <w:t xml:space="preserve">Muchos a muchos</w:t>
+            </w:r>
+          </w:p>
+        </w:tc>
+        <w:tc>
+          <w:tcPr/>
+          <w:p>
+            <w:pPr>
+              <w:pStyle w:val="Compact"/>
+            </w:pPr>
+            <w:r>
+              <w:rPr>
+                <w:sz w:val="19"/>
+                <w:lang w:val="es-CO"/>
+              </w:rPr>
+              <w:t xml:space="preserve">3: CERTIFICAR, PRESCRIBIR, ALMACENAR</w:t>
+            </w:r>
+          </w:p>
+        </w:tc>
+      </w:tr>
+      <w:tr>
+        <w:tc>
+          <w:tcPr/>
+          <w:p>
+            <w:pPr>
+              <w:pStyle w:val="Compact"/>
+            </w:pPr>
+            <w:r>
+              <w:rPr>
+                <w:sz w:val="19"/>
+                <w:lang w:val="es-CO"/>
+              </w:rPr>
+              <w:t xml:space="preserve">Extendido</w:t>
+            </w:r>
+          </w:p>
+        </w:tc>
+        <w:tc>
+          <w:tcPr/>
+          <w:p>
+            <w:pPr>
+              <w:pStyle w:val="Compact"/>
+            </w:pPr>
+            <w:r>
+              <w:rPr>
+                <w:sz w:val="19"/>
+                <w:lang w:val="es-CO"/>
+              </w:rPr>
+              <w:t xml:space="preserve">EMPLEADO: VETERINARIO/AUXILIAR; disyunta, parcial</w:t>
+            </w:r>
+          </w:p>
+        </w:tc>
+      </w:tr>
+      <w:tr>
+        <w:tc>
+          <w:tcPr/>
+          <w:p>
+            <w:pPr>
+              <w:pStyle w:val="Compact"/>
+            </w:pPr>
+            <w:r>
+              <w:rPr>
+                <w:sz w:val="19"/>
+                <w:lang w:val="es-CO"/>
+              </w:rPr>
+              <w:t xml:space="preserve">3FN</w:t>
+            </w:r>
+          </w:p>
+        </w:tc>
+        <w:tc>
+          <w:tcPr/>
+          <w:p>
+            <w:pPr>
+              <w:pStyle w:val="Compact"/>
+            </w:pPr>
+            <w:r>
+              <w:rPr>
+                <w:sz w:val="19"/>
+                <w:lang w:val="es-CO"/>
+              </w:rPr>
+              <w:t xml:space="preserve">Teléfonos→1FN; detalle→2FN; raza→especie, ciudad→departamento→3FN</w:t>
+            </w:r>
+          </w:p>
+        </w:tc>
+      </w:tr>
+      <w:tr>
+        <w:tc>
+          <w:tcPr/>
+          <w:p>
+            <w:pPr>
+              <w:pStyle w:val="Compact"/>
+            </w:pPr>
+            <w:r>
+              <w:rPr>
+                <w:sz w:val="19"/>
+                <w:lang w:val="es-CO"/>
+              </w:rPr>
+              <w:t xml:space="preserve">Consultas</w:t>
+            </w:r>
+          </w:p>
+        </w:tc>
+        <w:tc>
+          <w:tcPr/>
+          <w:p>
+            <w:pPr>
+              <w:pStyle w:val="Compact"/>
+            </w:pPr>
+            <w:r>
+              <w:rPr>
+                <w:sz w:val="19"/>
+                <w:lang w:val="es-CO"/>
+              </w:rPr>
+              <w:t xml:space="preserve">55 ejercicios: álgebra/SQL/resultados verificados</w:t>
             </w:r>
           </w:p>
         </w:tc>
@@ -3948,18 +3465,18 @@
           <wp:inline>
             <wp:extent cx="5334000" cy="3556000"/>
             <wp:effectExtent b="0" l="0" r="0" t="0"/>
-            <wp:docPr descr="Vista global del modelo (entidades y relaciones, notación Chen)" title="" id="37" name="Picture"/>
+            <wp:docPr descr="Vista global del modelo (entidades y relaciones, notación Chen)" title="" id="34" name="Picture"/>
             <a:graphic>
               <a:graphicData uri="http://schemas.openxmlformats.org/drawingml/2006/picture">
                 <pic:pic>
                   <pic:nvPicPr>
-                    <pic:cNvPr descr="diagramas/png/04_Chen_Global.png" id="38" name="Picture"/>
+                    <pic:cNvPr descr="diagramas/png/04_Chen_Global.png" id="35" name="Picture"/>
                     <pic:cNvPicPr>
                       <a:picLocks noChangeArrowheads="1" noChangeAspect="1"/>
                     </pic:cNvPicPr>
                   </pic:nvPicPr>
                   <pic:blipFill>
-                    <a:blip r:embed="rId36"/>
+                    <a:blip r:embed="rId33"/>
                     <a:stretch>
                       <a:fillRect/>
                     </a:stretch>
@@ -4001,13 +3518,13 @@
       <w:pPr>
         <w:pStyle w:val="Heading1"/>
       </w:pPr>
-      <w:bookmarkStart w:id="39" w:name="_7e48cebc24bd57d8d9e00b2f6328910ae97827f"/>
+      <w:bookmarkStart w:id="36" w:name="_metodología"/>
       <w:r>
         <w:rPr>
           <w:rStyle w:val="SectionNumber"/>
           <w:lang w:val="es-CO"/>
         </w:rPr>
-        <w:t xml:space="preserve">11</w:t>
+        <w:t xml:space="preserve">10</w:t>
       </w:r>
       <w:r>
         <w:tab/>
@@ -4016,9 +3533,9 @@
         <w:rPr>
           <w:lang w:val="es-CO"/>
         </w:rPr>
-        <w:t xml:space="preserve">Metodología y plan de trabajo</w:t>
-      </w:r>
-      <w:bookmarkEnd w:id="39"/>
+        <w:t xml:space="preserve">Metodología</w:t>
+      </w:r>
+      <w:bookmarkEnd w:id="36"/>
     </w:p>
     <w:p>
       <w:pPr>
@@ -4028,152 +3545,7 @@
         <w:rPr>
           <w:lang w:val="es-CO"/>
         </w:rPr>
-        <w:t xml:space="preserve">El proyecto sigue un ciclo de diseño de bases de datos en cascada con revisiones al final de cada fase:</w:t>
-      </w:r>
-    </w:p>
-    <w:p>
-      <w:pPr>
-        <w:pStyle w:val="Compact"/>
-        <w:numPr>
-          <w:ilvl w:val="0"/>
-          <w:numId w:val="1004"/>
-        </w:numPr>
-      </w:pPr>
-      <w:r>
-        <w:rPr>
-          <w:b/>
-          <w:bCs/>
-          <w:lang w:val="es-CO"/>
-        </w:rPr>
-        <w:t xml:space="preserve">Análisis:</w:t>
-      </w:r>
-      <w:r>
-        <w:rPr>
-          <w:lang w:val="es-CO"/>
-        </w:rPr>
-        <w:t xml:space="preserve"> </w:t>
-      </w:r>
-      <w:r>
-        <w:rPr>
-          <w:lang w:val="es-CO"/>
-        </w:rPr>
-        <w:t xml:space="preserve">levantamiento de requerimientos, supuestos y reglas de negocio.</w:t>
-      </w:r>
-    </w:p>
-    <w:p>
-      <w:pPr>
-        <w:pStyle w:val="Compact"/>
-        <w:numPr>
-          <w:ilvl w:val="0"/>
-          <w:numId w:val="1004"/>
-        </w:numPr>
-      </w:pPr>
-      <w:r>
-        <w:rPr>
-          <w:b/>
-          <w:bCs/>
-          <w:lang w:val="es-CO"/>
-        </w:rPr>
-        <w:t xml:space="preserve">Diseño conceptual:</w:t>
-      </w:r>
-      <w:r>
-        <w:rPr>
-          <w:lang w:val="es-CO"/>
-        </w:rPr>
-        <w:t xml:space="preserve"> </w:t>
-      </w:r>
-      <w:r>
-        <w:rPr>
-          <w:lang w:val="es-CO"/>
-        </w:rPr>
-        <w:t xml:space="preserve">MER en notación Chen y EER.</w:t>
-      </w:r>
-    </w:p>
-    <w:p>
-      <w:pPr>
-        <w:pStyle w:val="Compact"/>
-        <w:numPr>
-          <w:ilvl w:val="0"/>
-          <w:numId w:val="1004"/>
-        </w:numPr>
-      </w:pPr>
-      <w:r>
-        <w:rPr>
-          <w:b/>
-          <w:bCs/>
-          <w:lang w:val="es-CO"/>
-        </w:rPr>
-        <w:t xml:space="preserve">Diseño lógico:</w:t>
-      </w:r>
-      <w:r>
-        <w:rPr>
-          <w:lang w:val="es-CO"/>
-        </w:rPr>
-        <w:t xml:space="preserve"> </w:t>
-      </w:r>
-      <w:r>
-        <w:rPr>
-          <w:lang w:val="es-CO"/>
-        </w:rPr>
-        <w:t xml:space="preserve">modelo lógico Barker / Crow’s Foot, modelo relacional, normalización y diccionario.</w:t>
-      </w:r>
-    </w:p>
-    <w:p>
-      <w:pPr>
-        <w:pStyle w:val="Compact"/>
-        <w:numPr>
-          <w:ilvl w:val="0"/>
-          <w:numId w:val="1004"/>
-        </w:numPr>
-      </w:pPr>
-      <w:r>
-        <w:rPr>
-          <w:b/>
-          <w:bCs/>
-          <w:lang w:val="es-CO"/>
-        </w:rPr>
-        <w:t xml:space="preserve">Validación:</w:t>
-      </w:r>
-      <w:r>
-        <w:rPr>
-          <w:lang w:val="es-CO"/>
-        </w:rPr>
-        <w:t xml:space="preserve"> </w:t>
-      </w:r>
-      <w:r>
-        <w:rPr>
-          <w:lang w:val="es-CO"/>
-        </w:rPr>
-        <w:t xml:space="preserve">55 consultas de álgebra relacional verificadas con datos de prueba.</w:t>
-      </w:r>
-    </w:p>
-    <w:p>
-      <w:pPr>
-        <w:pStyle w:val="Compact"/>
-        <w:numPr>
-          <w:ilvl w:val="0"/>
-          <w:numId w:val="1004"/>
-        </w:numPr>
-      </w:pPr>
-      <w:r>
-        <w:rPr>
-          <w:b/>
-          <w:bCs/>
-          <w:lang w:val="es-CO"/>
-        </w:rPr>
-        <w:t xml:space="preserve">Diseño físico e implementación (Fase 2):</w:t>
-      </w:r>
-      <w:r>
-        <w:rPr>
-          <w:lang w:val="es-CO"/>
-        </w:rPr>
-        <w:t xml:space="preserve"> </w:t>
-      </w:r>
-      <w:r>
-        <w:rPr>
-          <w:lang w:val="es-CO"/>
-        </w:rPr>
-        <w:t xml:space="preserve">selección de SO y RDBMS, VM, scripts DDL/DML y aplicación web.</w:t>
+        <w:t xml:space="preserve">Cascada, revisando fases: análisis → Chen/EER → Barker/Crow’s Foot, relacional, normalización y diccionario → 55 consultas verificadas → SO/RDBMS, VM, DDL/DML y web (Fase 2).</w:t>
       </w:r>
     </w:p>
     <w:p>
@@ -4184,7 +3556,7 @@
         <w:rPr>
           <w:lang w:val="es-CO"/>
         </w:rPr>
-        <w:t xml:space="preserve">Hitos del proyecto</w:t>
+        <w:t xml:space="preserve">Hitos</w:t>
       </w:r>
     </w:p>
     <w:tbl>
@@ -4192,7 +3564,7 @@
         <w:tblStyle w:val="Table"/>
         <w:tblW w:type="auto" w:w="0"/>
         <w:tblLook w:firstRow="1" w:lastRow="0" w:firstColumn="0" w:lastColumn="0" w:noHBand="0" w:noVBand="0" w:val="0020"/>
-        <w:tblCaption w:val="Hitos del proyecto"/>
+        <w:tblCaption w:val="Hitos"/>
         <w:tblBorders>
           <w:top w:val="single" w:sz="4" w:color="A6A6A6"/>
           <w:left w:val="single" w:sz="4" w:color="A6A6A6"/>
@@ -4274,7 +3646,7 @@
                 <w:sz w:val="19"/>
                 <w:lang w:val="es-CO"/>
               </w:rPr>
-              <w:t xml:space="preserve">Inicio del proyecto y acta de constitución</w:t>
+              <w:t xml:space="preserve">Inicio y acta</w:t>
             </w:r>
           </w:p>
         </w:tc>
@@ -4306,7 +3678,7 @@
                 <w:sz w:val="19"/>
                 <w:lang w:val="es-CO"/>
               </w:rPr>
-              <w:t xml:space="preserve">Envío de la propuesta y la Fase 1 para validación del docente</w:t>
+              <w:t xml:space="preserve">Validación docente: propuesta/Fase 1</w:t>
             </w:r>
           </w:p>
         </w:tc>
@@ -4338,7 +3710,7 @@
                 <w:sz w:val="19"/>
                 <w:lang w:val="es-CO"/>
               </w:rPr>
-              <w:t xml:space="preserve">Entrega Fase 2 (VM, RDBMS, scripts, app, repositorio, video)</w:t>
+              <w:t xml:space="preserve">Fase 2: VM/RDBMS/scripts/app/repositorio/video</w:t>
             </w:r>
           </w:p>
         </w:tc>
@@ -4380,13 +3752,13 @@
       <w:pPr>
         <w:pStyle w:val="Heading1"/>
       </w:pPr>
-      <w:bookmarkStart w:id="40" w:name="_b08113b4079701843e5a147ede51fbfebaf0304"/>
+      <w:bookmarkStart w:id="37" w:name="_equipo"/>
       <w:r>
         <w:rPr>
           <w:rStyle w:val="SectionNumber"/>
           <w:lang w:val="es-CO"/>
         </w:rPr>
-        <w:t xml:space="preserve">12</w:t>
+        <w:t xml:space="preserve">11</w:t>
       </w:r>
       <w:r>
         <w:tab/>
@@ -4395,9 +3767,9 @@
         <w:rPr>
           <w:lang w:val="es-CO"/>
         </w:rPr>
-        <w:t xml:space="preserve">Equipo de trabajo</w:t>
-      </w:r>
-      <w:bookmarkEnd w:id="40"/>
+        <w:t xml:space="preserve">Equipo</w:t>
+      </w:r>
+      <w:bookmarkEnd w:id="37"/>
     </w:p>
     <w:p>
       <w:pPr>
@@ -4407,7 +3779,7 @@
         <w:rPr>
           <w:lang w:val="es-CO"/>
         </w:rPr>
-        <w:t xml:space="preserve">Roles del equipo</w:t>
+        <w:t xml:space="preserve">Equipo</w:t>
       </w:r>
     </w:p>
     <w:tbl>
@@ -4416,7 +3788,7 @@
         <w:tblW w:type="pct" w:w="5000"/>
         <w:tblLayout w:type="fixed"/>
         <w:tblLook w:firstRow="1" w:lastRow="0" w:firstColumn="0" w:lastColumn="0" w:noHBand="0" w:noVBand="0" w:val="0020"/>
-        <w:tblCaption w:val="Roles del equipo"/>
+        <w:tblCaption w:val="Equipo"/>
         <w:tblBorders>
           <w:top w:val="single" w:sz="4" w:color="A6A6A6"/>
           <w:left w:val="single" w:sz="4" w:color="A6A6A6"/>
@@ -4532,7 +3904,7 @@
                 <w:sz w:val="19"/>
                 <w:lang w:val="es-CO"/>
               </w:rPr>
-              <w:t xml:space="preserve">Planeación, modelo relacional, normalización, scripts y control de versiones</w:t>
+              <w:t xml:space="preserve">Planeación, relacional, normalización, scripts, versionado</w:t>
             </w:r>
           </w:p>
         </w:tc>
@@ -4579,7 +3951,7 @@
                 <w:sz w:val="19"/>
                 <w:lang w:val="es-CO"/>
               </w:rPr>
-              <w:t xml:space="preserve">Requerimientos, supuestos, MER Chen/EER, diccionario de datos</w:t>
+              <w:t xml:space="preserve">Requerimientos/supuestos/Chen/EER/diccionario</w:t>
             </w:r>
           </w:p>
         </w:tc>
@@ -4626,7 +3998,7 @@
                 <w:sz w:val="19"/>
                 <w:lang w:val="es-CO"/>
               </w:rPr>
-              <w:t xml:space="preserve">Álgebra relacional y SQL, máquina virtual, aplicación web</w:t>
+              <w:t xml:space="preserve">Álgebra/SQL/VM/web</w:t>
             </w:r>
           </w:p>
         </w:tc>
@@ -4636,13 +4008,13 @@
       <w:pPr>
         <w:pStyle w:val="Heading1"/>
       </w:pPr>
-      <w:bookmarkStart w:id="41" w:name="_herramientas"/>
+      <w:bookmarkStart w:id="38" w:name="_herramientas"/>
       <w:r>
         <w:rPr>
           <w:rStyle w:val="SectionNumber"/>
           <w:lang w:val="es-CO"/>
         </w:rPr>
-        <w:t xml:space="preserve">13</w:t>
+        <w:t xml:space="preserve">12</w:t>
       </w:r>
       <w:r>
         <w:tab/>
@@ -4653,7 +4025,7 @@
         </w:rPr>
         <w:t xml:space="preserve">Herramientas</w:t>
       </w:r>
-      <w:bookmarkEnd w:id="41"/>
+      <w:bookmarkEnd w:id="38"/>
     </w:p>
     <w:p>
       <w:pPr>
@@ -4663,7 +4035,7 @@
         <w:rPr>
           <w:lang w:val="es-CO"/>
         </w:rPr>
-        <w:t xml:space="preserve">Herramientas previstas</w:t>
+        <w:t xml:space="preserve">Herramientas</w:t>
       </w:r>
     </w:p>
     <w:tbl>
@@ -4672,7 +4044,7 @@
         <w:tblW w:type="pct" w:w="5000"/>
         <w:tblLayout w:type="fixed"/>
         <w:tblLook w:firstRow="1" w:lastRow="0" w:firstColumn="0" w:lastColumn="0" w:noHBand="0" w:noVBand="0" w:val="0020"/>
-        <w:tblCaption w:val="Herramientas previstas"/>
+        <w:tblCaption w:val="Herramientas"/>
         <w:tblBorders>
           <w:top w:val="single" w:sz="4" w:color="A6A6A6"/>
           <w:left w:val="single" w:sz="4" w:color="A6A6A6"/>
@@ -4754,24 +4126,24 @@
                 <w:sz w:val="19"/>
                 <w:lang w:val="es-CO"/>
               </w:rPr>
-              <w:t xml:space="preserve">Draw.io para los modelos de datos; MySQL Workbench para administrar y consultar el esquema</w:t>
-            </w:r>
-          </w:p>
-        </w:tc>
-      </w:tr>
-      <w:tr>
-        <w:tc>
-          <w:tcPr/>
-          <w:p>
-            <w:pPr>
-              <w:pStyle w:val="Compact"/>
-            </w:pPr>
-            <w:r>
-              <w:rPr>
-                <w:sz w:val="19"/>
-                <w:lang w:val="es-CO"/>
-              </w:rPr>
-              <w:t xml:space="preserve">Sistema operativo (VM)</w:t>
+              <w:t xml:space="preserve">Draw.io; MySQL Workbench: administración/consultas</w:t>
+            </w:r>
+          </w:p>
+        </w:tc>
+      </w:tr>
+      <w:tr>
+        <w:tc>
+          <w:tcPr/>
+          <w:p>
+            <w:pPr>
+              <w:pStyle w:val="Compact"/>
+            </w:pPr>
+            <w:r>
+              <w:rPr>
+                <w:sz w:val="19"/>
+                <w:lang w:val="es-CO"/>
+              </w:rPr>
+              <w:t xml:space="preserve">SO (VM)</w:t>
             </w:r>
           </w:p>
         </w:tc>
@@ -4818,7 +4190,7 @@
                 <w:sz w:val="19"/>
                 <w:lang w:val="es-CO"/>
               </w:rPr>
-              <w:t xml:space="preserve">MySQL 8.4 LTS (Community), administrado con MySQL Workbench</w:t>
+              <w:t xml:space="preserve">MySQL 8.4 LTS (Community), MySQL Workbench</w:t>
             </w:r>
           </w:p>
         </w:tc>
@@ -4867,7 +4239,7 @@
                 <w:sz w:val="19"/>
                 <w:lang w:val="es-CO"/>
               </w:rPr>
-              <w:t xml:space="preserve">Control de versiones</w:t>
+              <w:t xml:space="preserve">Versionado</w:t>
             </w:r>
           </w:p>
         </w:tc>
@@ -4924,13 +4296,13 @@
       <w:pPr>
         <w:pStyle w:val="Heading1"/>
       </w:pPr>
-      <w:bookmarkStart w:id="42" w:name="_28b2ef1797c554346d74536cd06e044a6c546c1"/>
+      <w:bookmarkStart w:id="39" w:name="_riesgos"/>
       <w:r>
         <w:rPr>
           <w:rStyle w:val="SectionNumber"/>
           <w:lang w:val="es-CO"/>
         </w:rPr>
-        <w:t xml:space="preserve">14</w:t>
+        <w:t xml:space="preserve">13</w:t>
       </w:r>
       <w:r>
         <w:tab/>
@@ -4939,9 +4311,9 @@
         <w:rPr>
           <w:lang w:val="es-CO"/>
         </w:rPr>
-        <w:t xml:space="preserve">Riesgos iniciales</w:t>
-      </w:r>
-      <w:bookmarkEnd w:id="42"/>
+        <w:t xml:space="preserve">Riesgos</w:t>
+      </w:r>
+      <w:bookmarkEnd w:id="39"/>
     </w:p>
     <w:p>
       <w:pPr>
@@ -4951,7 +4323,7 @@
         <w:rPr>
           <w:lang w:val="es-CO"/>
         </w:rPr>
-        <w:t xml:space="preserve">Riesgos iniciales</w:t>
+        <w:t xml:space="preserve">Riesgos</w:t>
       </w:r>
     </w:p>
     <w:tbl>
@@ -4960,7 +4332,7 @@
         <w:tblW w:type="pct" w:w="5000"/>
         <w:tblLayout w:type="fixed"/>
         <w:tblLook w:firstRow="1" w:lastRow="0" w:firstColumn="0" w:lastColumn="0" w:noHBand="0" w:noVBand="0" w:val="0020"/>
-        <w:tblCaption w:val="Riesgos iniciales"/>
+        <w:tblCaption w:val="Riesgos"/>
         <w:tblBorders>
           <w:top w:val="single" w:sz="4" w:color="A6A6A6"/>
           <w:left w:val="single" w:sz="4" w:color="A6A6A6"/>
@@ -5065,7 +4437,7 @@
                 <w:sz w:val="19"/>
                 <w:lang w:val="es-CO"/>
               </w:rPr>
-              <w:t xml:space="preserve">Recursos limitados del equipo para la VM</w:t>
+              <w:t xml:space="preserve">Recursos VM limitados</w:t>
             </w:r>
           </w:p>
         </w:tc>
@@ -5110,24 +4482,24 @@
                 <w:sz w:val="19"/>
                 <w:lang w:val="es-CO"/>
               </w:rPr>
-              <w:t xml:space="preserve">MySQL consume poca memoria; VM de 6 GB</w:t>
-            </w:r>
-          </w:p>
-        </w:tc>
-      </w:tr>
-      <w:tr>
-        <w:tc>
-          <w:tcPr/>
-          <w:p>
-            <w:pPr>
-              <w:pStyle w:val="Compact"/>
-            </w:pPr>
-            <w:r>
-              <w:rPr>
-                <w:sz w:val="19"/>
-                <w:lang w:val="es-CO"/>
-              </w:rPr>
-              <w:t xml:space="preserve">Cambios de alcance tardíos</w:t>
+              <w:t xml:space="preserve">MySQL, VM de 6 GB</w:t>
+            </w:r>
+          </w:p>
+        </w:tc>
+      </w:tr>
+      <w:tr>
+        <w:tc>
+          <w:tcPr/>
+          <w:p>
+            <w:pPr>
+              <w:pStyle w:val="Compact"/>
+            </w:pPr>
+            <w:r>
+              <w:rPr>
+                <w:sz w:val="19"/>
+                <w:lang w:val="es-CO"/>
+              </w:rPr>
+              <w:t xml:space="preserve">Alcance tardío</w:t>
             </w:r>
           </w:p>
         </w:tc>
@@ -5172,24 +4544,24 @@
                 <w:sz w:val="19"/>
                 <w:lang w:val="es-CO"/>
               </w:rPr>
-              <w:t xml:space="preserve">Supuestos aprobados por el docente al inicio</w:t>
-            </w:r>
-          </w:p>
-        </w:tc>
-      </w:tr>
-      <w:tr>
-        <w:tc>
-          <w:tcPr/>
-          <w:p>
-            <w:pPr>
-              <w:pStyle w:val="Compact"/>
-            </w:pPr>
-            <w:r>
-              <w:rPr>
-                <w:sz w:val="19"/>
-                <w:lang w:val="es-CO"/>
-              </w:rPr>
-              <w:t xml:space="preserve">Modelo con errores de cardinalidad</w:t>
+              <w:t xml:space="preserve">Aprobación docente inicial</w:t>
+            </w:r>
+          </w:p>
+        </w:tc>
+      </w:tr>
+      <w:tr>
+        <w:tc>
+          <w:tcPr/>
+          <w:p>
+            <w:pPr>
+              <w:pStyle w:val="Compact"/>
+            </w:pPr>
+            <w:r>
+              <w:rPr>
+                <w:sz w:val="19"/>
+                <w:lang w:val="es-CO"/>
+              </w:rPr>
+              <w:t xml:space="preserve">Cardinalidades erróneas</w:t>
             </w:r>
           </w:p>
         </w:tc>
@@ -5234,24 +4606,24 @@
                 <w:sz w:val="19"/>
                 <w:lang w:val="es-CO"/>
               </w:rPr>
-              <w:t xml:space="preserve">Validación con 55 consultas sobre datos de prueba</w:t>
-            </w:r>
-          </w:p>
-        </w:tc>
-      </w:tr>
-      <w:tr>
-        <w:tc>
-          <w:tcPr/>
-          <w:p>
-            <w:pPr>
-              <w:pStyle w:val="Compact"/>
-            </w:pPr>
-            <w:r>
-              <w:rPr>
-                <w:sz w:val="19"/>
-                <w:lang w:val="es-CO"/>
-              </w:rPr>
-              <w:t xml:space="preserve">Aportes desiguales en GitHub</w:t>
+              <w:t xml:space="preserve">Validar con 55 consultas</w:t>
+            </w:r>
+          </w:p>
+        </w:tc>
+      </w:tr>
+      <w:tr>
+        <w:tc>
+          <w:tcPr/>
+          <w:p>
+            <w:pPr>
+              <w:pStyle w:val="Compact"/>
+            </w:pPr>
+            <w:r>
+              <w:rPr>
+                <w:sz w:val="19"/>
+                <w:lang w:val="es-CO"/>
+              </w:rPr>
+              <w:t xml:space="preserve">Aportes GitHub desiguales</w:t>
             </w:r>
           </w:p>
         </w:tc>
@@ -5296,82 +4668,12 @@
                 <w:sz w:val="19"/>
                 <w:lang w:val="es-CO"/>
               </w:rPr>
-              <w:t xml:space="preserve">Reparto de tareas por integrante y revisión semanal</w:t>
+              <w:t xml:space="preserve">Asignación individual, revisión semanal</w:t>
             </w:r>
           </w:p>
         </w:tc>
       </w:tr>
     </w:tbl>
-    <w:p>
-      <w:pPr>
-        <w:pStyle w:val="Heading1"/>
-      </w:pPr>
-      <w:bookmarkStart w:id="43" w:name="_conclusión"/>
-      <w:r>
-        <w:rPr>
-          <w:rStyle w:val="SectionNumber"/>
-          <w:lang w:val="es-CO"/>
-        </w:rPr>
-        <w:t xml:space="preserve">15</w:t>
-      </w:r>
-      <w:r>
-        <w:tab/>
-      </w:r>
-      <w:r>
-        <w:rPr>
-          <w:lang w:val="es-CO"/>
-        </w:rPr>
-        <w:t xml:space="preserve">Conclusión</w:t>
-      </w:r>
-      <w:bookmarkEnd w:id="43"/>
-    </w:p>
-    <w:p>
-      <w:pPr>
-        <w:pStyle w:val="FirstParagraph"/>
-      </w:pPr>
-      <w:r>
-        <w:rPr>
-          <w:lang w:val="es-CO"/>
-        </w:rPr>
-        <w:t xml:space="preserve">SIGEVET resuelve una necesidad real de integración de información en una red de clínicas veterinarias y permite</w:t>
-      </w:r>
-      <w:r>
-        <w:rPr>
-          <w:lang w:val="es-CO"/>
-        </w:rPr>
-        <w:t xml:space="preserve"> </w:t>
-      </w:r>
-      <w:r>
-        <w:rPr>
-          <w:lang w:val="es-CO"/>
-        </w:rPr>
-        <w:t xml:space="preserve">aplicar de forma completa los contenidos de Bases de Datos 1. El modelo propuesto tiene 18 entidades, todos los tipos</w:t>
-      </w:r>
-      <w:r>
-        <w:rPr>
-          <w:lang w:val="es-CO"/>
-        </w:rPr>
-        <w:t xml:space="preserve"> </w:t>
-      </w:r>
-      <w:r>
-        <w:rPr>
-          <w:lang w:val="es-CO"/>
-        </w:rPr>
-        <w:t xml:space="preserve">de relación, una especialización y un esquema que exige normalización hasta 3FN, por lo que el equipo considera que</w:t>
-      </w:r>
-      <w:r>
-        <w:rPr>
-          <w:lang w:val="es-CO"/>
-        </w:rPr>
-        <w:t xml:space="preserve"> </w:t>
-      </w:r>
-      <w:r>
-        <w:rPr>
-          <w:lang w:val="es-CO"/>
-        </w:rPr>
-        <w:t xml:space="preserve">la propuesta es viable, suficientemente compleja y alineada con los objetivos de la asignatura.</w:t>
-      </w:r>
-    </w:p>
     <w:sectPr>
       <w:headerReference w:type="default" r:id="rId9"/>
       <w:footerReference w:type="default" r:id="rId10"/>
@@ -5756,36 +5058,6 @@
   </w:num>
   <w:num w:numId="1003">
     <w:abstractNumId w:val="991"/>
-  </w:num>
-  <w:num w:numId="1004">
-    <w:abstractNumId w:val="99411"/>
-    <w:lvlOverride w:ilvl="0">
-      <w:startOverride w:val="1"/>
-    </w:lvlOverride>
-    <w:lvlOverride w:ilvl="1">
-      <w:startOverride w:val="1"/>
-    </w:lvlOverride>
-    <w:lvlOverride w:ilvl="2">
-      <w:startOverride w:val="1"/>
-    </w:lvlOverride>
-    <w:lvlOverride w:ilvl="3">
-      <w:startOverride w:val="1"/>
-    </w:lvlOverride>
-    <w:lvlOverride w:ilvl="4">
-      <w:startOverride w:val="1"/>
-    </w:lvlOverride>
-    <w:lvlOverride w:ilvl="5">
-      <w:startOverride w:val="1"/>
-    </w:lvlOverride>
-    <w:lvlOverride w:ilvl="6">
-      <w:startOverride w:val="1"/>
-    </w:lvlOverride>
-    <w:lvlOverride w:ilvl="7">
-      <w:startOverride w:val="1"/>
-    </w:lvlOverride>
-    <w:lvlOverride w:ilvl="8">
-      <w:startOverride w:val="1"/>
-    </w:lvlOverride>
   </w:num>
 </w:numbering>
 </file>

</xml_diff>

<commit_message>
docs: correcciones y tono natural en los documentos Word
Errores corregidos: regex del diccionario convertida en nota al pie, script 02_comentarios.sql que no existe, limites de Oracle Free en los supuestos, MINUS en vez de EXCEPT, VET_APP, ejercicio 22 en vez de 21, rutas entregables/ y docs/src, paginacion que la app no tiene. Frases telegraficas reescritas sin pasar del 5 % de palabras por documento. El diccionario .xlsx y el DDL de Workbench pasan a relaciones en infinitivo.
</commit_message>
<xml_diff>
--- a/documentos/fase1/01_Propuesta_del_Proyecto.docx
+++ b/documentos/fase1/01_Propuesta_del_Proyecto.docx
@@ -351,7 +351,7 @@
         <w:rPr>
           <w:lang w:val="es-CO"/>
         </w:rPr>
-        <w:t xml:space="preserve">Fundada en Bogotá, 2018. Atiende perros/gatos/aves/conejos/hámsteres. Sedes: Usaquén y Chapinero (Bogotá D.C.), Chía (Cundinamarca), Laureles (Medellín), San Fernando (Cali).</w:t>
+        <w:t xml:space="preserve">Fundada en Bogotá en 2018, Huella Sana atiende perros, gatos, aves, conejos y hámsteres. Sus sedes son Usaquén y Chapinero (Bogotá D.C.), Chía (Cundinamarca), Laureles (Medellín) y San Fernando (Cali).</w:t>
       </w:r>
     </w:p>
     <w:p>
@@ -968,7 +968,7 @@
         <w:rPr>
           <w:lang w:val="es-CO"/>
         </w:rPr>
-        <w:t xml:space="preserve">¿Cómo centralizar cinco sedes en una base clínica, operativa y comercial 3FN consultable por web?</w:t>
+        <w:t xml:space="preserve">¿Cómo centralizar cinco sedes en una base clínica, operativa y comercial en 3FN que se consulte por web?</w:t>
       </w:r>
     </w:p>
     <w:p>
@@ -1002,7 +1002,7 @@
         <w:rPr>
           <w:lang w:val="es-CO"/>
         </w:rPr>
-        <w:t xml:space="preserve">Centralizar reduce duplicados y controla integridad; aplica modelado, especialización, normalización y consultas sobre Linux.</w:t>
+        <w:t xml:space="preserve">Centralizar reduce los duplicados y facilita el control de la integridad; además permite aplicar modelado, especialización, normalización y consultas sobre Linux.</w:t>
       </w:r>
     </w:p>
     <w:p>
@@ -1059,7 +1059,7 @@
         <w:rPr>
           <w:lang w:val="es-CO"/>
         </w:rPr>
-        <w:t xml:space="preserve">Diseñar e implementar SIGEVET: modelo conceptual, MySQL en VM Oracle Linux y consulta web.</w:t>
+        <w:t xml:space="preserve">Diseñar e implementar SIGEVET: del modelo conceptual a MySQL en una VM con Oracle Linux, con consulta web.</w:t>
       </w:r>
     </w:p>
     <w:p>
@@ -3545,7 +3545,7 @@
         <w:rPr>
           <w:lang w:val="es-CO"/>
         </w:rPr>
-        <w:t xml:space="preserve">Cascada, revisando fases: análisis → Chen/EER → Barker/Crow’s Foot, relacional, normalización y diccionario → 55 consultas verificadas → SO/RDBMS, VM, DDL/DML y web (Fase 2).</w:t>
+        <w:t xml:space="preserve">Se trabajó en cascada, revisando cada fase: análisis → Chen/EER → Barker/Crow’s Foot, relacional, normalización y diccionario → 55 consultas verificadas → SO/RDBMS, VM, DDL/DML y web (Fase 2).</w:t>
       </w:r>
     </w:p>
     <w:p>

</xml_diff>

<commit_message>
docs: revision completa de base de datos, app y documentos; presentacion nueva en PowerPoint
Se probaron la base y la app, se corrigieron los documentos, los README y los nombres de relacion,
las claves de cargar_bd.sh ya no viajan en la linea de comandos, y se reemplazan las versiones
viejas del documento final y de la presentacion.
</commit_message>
<xml_diff>
--- a/documentos/fase1/01_Propuesta_del_Proyecto.docx
+++ b/documentos/fase1/01_Propuesta_del_Proyecto.docx
@@ -351,7 +351,7 @@
         <w:rPr>
           <w:lang w:val="es-CO"/>
         </w:rPr>
-        <w:t xml:space="preserve">Fundada en Bogotá, 2018. Atiende perros/gatos/aves/conejos/hámsteres. Sedes: Usaquén y Chapinero (Bogotá D.C.), Chía (Cundinamarca), Laureles (Medellín), San Fernando (Cali).</w:t>
+        <w:t xml:space="preserve">Fundada en Bogotá en 2018, Huella Sana atiende perros, gatos, aves, conejos y hámsteres. Sus sedes son Usaquén y Chapinero (Bogotá D.C.), Chía (Cundinamarca), Laureles (Medellín) y San Fernando (Cali).</w:t>
       </w:r>
     </w:p>
     <w:p>
@@ -968,7 +968,7 @@
         <w:rPr>
           <w:lang w:val="es-CO"/>
         </w:rPr>
-        <w:t xml:space="preserve">¿Cómo centralizar cinco sedes en una base clínica, operativa y comercial 3FN consultable por web?</w:t>
+        <w:t xml:space="preserve">¿Cómo centralizar cinco sedes en una base clínica, operativa y comercial en 3FN que se consulte por web?</w:t>
       </w:r>
     </w:p>
     <w:p>
@@ -1002,7 +1002,7 @@
         <w:rPr>
           <w:lang w:val="es-CO"/>
         </w:rPr>
-        <w:t xml:space="preserve">Centralizar reduce duplicados y controla integridad; aplica modelado, especialización, normalización y consultas sobre Linux.</w:t>
+        <w:t xml:space="preserve">Centralizar reduce los duplicados y facilita el control de la integridad; además permite aplicar modelado, especialización, normalización y consultas sobre Linux.</w:t>
       </w:r>
     </w:p>
     <w:p>
@@ -1059,7 +1059,7 @@
         <w:rPr>
           <w:lang w:val="es-CO"/>
         </w:rPr>
-        <w:t xml:space="preserve">Diseñar e implementar SIGEVET: modelo conceptual, MySQL en VM Oracle Linux y consulta web.</w:t>
+        <w:t xml:space="preserve">Diseñar e implementar SIGEVET: del modelo conceptual a MySQL en una VM con Oracle Linux, con consulta web.</w:t>
       </w:r>
     </w:p>
     <w:p>
@@ -3545,7 +3545,7 @@
         <w:rPr>
           <w:lang w:val="es-CO"/>
         </w:rPr>
-        <w:t xml:space="preserve">Cascada, revisando fases: análisis → Chen/EER → Barker/Crow’s Foot, relacional, normalización y diccionario → 55 consultas verificadas → SO/RDBMS, VM, DDL/DML y web (Fase 2).</w:t>
+        <w:t xml:space="preserve">Se trabajó en cascada, revisando cada fase: análisis → Chen/EER → Barker/Crow’s Foot, relacional, normalización y diccionario → 55 consultas verificadas → SO/RDBMS, VM, DDL/DML y web (Fase 2).</w:t>
       </w:r>
     </w:p>
     <w:p>

</xml_diff>

<commit_message>
Revisar documentos y aclarar cruces de modelos
</commit_message>
<xml_diff>
--- a/documentos/fase1/01_Propuesta_del_Proyecto.docx
+++ b/documentos/fase1/01_Propuesta_del_Proyecto.docx
@@ -453,7 +453,7 @@
                 <w:sz w:val="19"/>
                 <w:lang w:val="es-CO"/>
               </w:rPr>
-              <w:t xml:space="preserve">5 clínicas, 4 ciudades, director por sede</w:t>
+              <w:t>5 clínicas en 4 ciudades; cada sede tiene un director previsto, aunque el esquema permite asignarlo posteriormente</w:t>
             </w:r>
           </w:p>
         </w:tc>
@@ -1127,7 +1127,7 @@
         <w:rPr>
           <w:lang w:val="es-CO"/>
         </w:rPr>
-        <w:t xml:space="preserve">Modelar Barker/Crow’s Foot y relacional: MySQL Workbench.</w:t>
+        <w:t>Modelar Barker, Crow’s Foot y el esquema relacional en Draw.io.</w:t>
       </w:r>
     </w:p>
     <w:p>
@@ -1855,7 +1855,7 @@
                 <w:sz w:val="19"/>
                 <w:lang w:val="es-CO"/>
               </w:rPr>
-              <w:t xml:space="preserve">Sede: ciudad y director único</w:t>
+              <w:t>Sede: ciudad y director único; la asignación del director puede quedar pendiente</w:t>
             </w:r>
           </w:p>
         </w:tc>

</xml_diff>